<commit_message>
Add initial tool runner scaffold
</commit_message>
<xml_diff>
--- a/docs/JARVIS_Audit_2026-05-16.docx
+++ b/docs/JARVIS_Audit_2026-05-16.docx
@@ -25,7 +25,49 @@
         <w:rPr>
           <w:color w:val="666666"/>
         </w:rPr>
-        <w:t xml:space="preserve">Baseline: ARCHITECTURE.md v3.1 (14 May 2026)  |  Audit date: 16 May 2026  |  Auditor: Claude Opus 4.7  | </w:t>
+        <w:t>Baseline: ARCHITECTURE.md v3.1 (14 May 2026</w:t>
+      </w:r>
+      <w:proofErr w:type="gramStart"/>
+      <w:r>
+        <w:rPr>
+          <w:color w:val="666666"/>
+        </w:rPr>
+        <w:t>)  |</w:t>
+      </w:r>
+      <w:proofErr w:type="gramEnd"/>
+      <w:r>
+        <w:rPr>
+          <w:color w:val="666666"/>
+        </w:rPr>
+        <w:t xml:space="preserve">  Audit date: 16 May </w:t>
+      </w:r>
+      <w:proofErr w:type="gramStart"/>
+      <w:r>
+        <w:rPr>
+          <w:color w:val="666666"/>
+        </w:rPr>
+        <w:t>2026  |</w:t>
+      </w:r>
+      <w:proofErr w:type="gramEnd"/>
+      <w:r>
+        <w:rPr>
+          <w:color w:val="666666"/>
+        </w:rPr>
+        <w:t xml:space="preserve">  Auditor: Claude Opus </w:t>
+      </w:r>
+      <w:proofErr w:type="gramStart"/>
+      <w:r>
+        <w:rPr>
+          <w:color w:val="666666"/>
+        </w:rPr>
+        <w:t>4.7  |</w:t>
+      </w:r>
+      <w:proofErr w:type="gramEnd"/>
+      <w:r>
+        <w:rPr>
+          <w:color w:val="666666"/>
+        </w:rPr>
+        <w:t xml:space="preserve"> </w:t>
       </w:r>
     </w:p>
     <w:p>
@@ -6760,7 +6802,39 @@
         </w:r>
       </w:hyperlink>
       <w:r>
-        <w:t>) is good: generate() and stream() both take signal, both return shaped results, the StreamResult = { events: AsyncIterable&lt;StreamEvent&gt; } collapse is correct, and the StreamEvent union holds protocol slots for tool calls without forcing them on implementers. Two structural issues:</w:t>
+        <w:t>) is good: </w:t>
+      </w:r>
+      <w:proofErr w:type="gramStart"/>
+      <w:r>
+        <w:t>generate(</w:t>
+      </w:r>
+      <w:proofErr w:type="gramEnd"/>
+      <w:r>
+        <w:t>) and </w:t>
+      </w:r>
+      <w:proofErr w:type="gramStart"/>
+      <w:r>
+        <w:t>stream(</w:t>
+      </w:r>
+      <w:proofErr w:type="gramEnd"/>
+      <w:r>
+        <w:t xml:space="preserve">) both take signal, both return shaped results, the StreamResult = </w:t>
+      </w:r>
+      <w:proofErr w:type="gramStart"/>
+      <w:r>
+        <w:t>{ events</w:t>
+      </w:r>
+      <w:proofErr w:type="gramEnd"/>
+      <w:r>
+        <w:t>: AsyncIterable&lt;StreamEvent</w:t>
+      </w:r>
+      <w:proofErr w:type="gramStart"/>
+      <w:r>
+        <w:t>&gt; }</w:t>
+      </w:r>
+      <w:proofErr w:type="gramEnd"/>
+      <w:r>
+        <w:t> collapse is correct, and the StreamEvent union holds protocol slots for tool calls without forcing them on implementers. Two structural issues:</w:t>
       </w:r>
     </w:p>
     <w:p>
@@ -8935,6 +9009,1915 @@
     <w:p>
       <w:pPr>
         <w:ind w:right="1199"/>
+        <w:rPr>
+          <w:b/>
+          <w:bCs/>
+        </w:rPr>
+      </w:pPr>
+      <w:r>
+        <w:rPr>
+          <w:b/>
+          <w:bCs/>
+        </w:rPr>
+        <w:t>Audit — Post-Router / Safety / Tools / Evals</w:t>
+      </w:r>
+    </w:p>
+    <w:p>
+      <w:pPr>
+        <w:ind w:right="1199"/>
+      </w:pPr>
+      <w:r>
+        <w:t>Where the build is</w:t>
+      </w:r>
+    </w:p>
+    <w:p>
+      <w:pPr>
+        <w:ind w:right="1199"/>
+      </w:pPr>
+      <w:r>
+        <w:t>Six new subsystems have landed: deterministic router (src/lib/router/), safety enforcement (router/enforcement.ts), typed SSE streaming module (src/lib/streaming/sse.ts), SQLite persistence (src/lib/db/), eval framework (src/lib/evals/ + scripts/run-eval.ts), and a tool registry scaffold (src/lib/tools/ with one mock tool). Route is wired through all of them. Telemetry event type union grew safety_blocked and confirmation_required. The config layer split into runtime/config.ts (pure) + config.ts (server-only re-export). DB layer split into client-node.ts (pure) + client.ts (server-only re-export) + node.ts (server-only barrel) + index.ts (server-only barrel). Tests stand at 30+ green.</w:t>
+      </w:r>
+    </w:p>
+    <w:p>
+      <w:pPr>
+        <w:ind w:right="1199"/>
+      </w:pPr>
+      <w:r>
+        <w:t>This is real progress. The audit below is sorted by what would hurt Phase 2 most.</w:t>
+      </w:r>
+    </w:p>
+    <w:p>
+      <w:pPr>
+        <w:ind w:right="1199"/>
+      </w:pPr>
+      <w:r>
+        <w:pict w14:anchorId="2DCC0821">
+          <v:rect id="_x0000_i1049" style="width:0;height:0" o:hralign="center" o:hrstd="t" o:hr="t" fillcolor="#a0a0a0" stroked="f"/>
+        </w:pict>
+      </w:r>
+    </w:p>
+    <w:p>
+      <w:pPr>
+        <w:ind w:right="1199"/>
+      </w:pPr>
+      <w:r>
+        <w:lastRenderedPageBreak/>
+        <w:t>P0 — Must fix before Phase 2 lands (and one that hurts today)</w:t>
+      </w:r>
+    </w:p>
+    <w:p>
+      <w:pPr>
+        <w:ind w:right="1199"/>
+      </w:pPr>
+      <w:r>
+        <w:t>1. Safety enforcement currently denies plain chat. Shipping blocker today.</w:t>
+      </w:r>
+    </w:p>
+    <w:p>
+      <w:pPr>
+        <w:ind w:right="1199"/>
+      </w:pPr>
+      <w:hyperlink r:id="rId23" w:tgtFrame="_blank" w:history="1">
+        <w:r>
+          <w:rPr>
+            <w:rStyle w:val="Hyperlink"/>
+          </w:rPr>
+          <w:t>router/enforcement.ts:37-50</w:t>
+        </w:r>
+      </w:hyperlink>
+      <w:r>
+        <w:t> returns HTTP 409 (confirmation_required) for any request whose latest user message matches the CONFIRM_ONCE or CONFIRM_ALWAYS regex in </w:t>
+      </w:r>
+      <w:hyperlink r:id="rId24" w:tgtFrame="_blank" w:history="1">
+        <w:r>
+          <w:rPr>
+            <w:rStyle w:val="Hyperlink"/>
+          </w:rPr>
+          <w:t>safety.ts:18-30</w:t>
+        </w:r>
+      </w:hyperlink>
+      <w:r>
+        <w:t>. The regexes match common conversation verbs (edit | write to | save | create | update | modify | rename | delete | wipe | erase | drop table | rm -rf | …).</w:t>
+      </w:r>
+    </w:p>
+    <w:p>
+      <w:pPr>
+        <w:ind w:right="1199"/>
+      </w:pPr>
+      <w:r>
+        <w:t>Concrete failures from realistic chat:</w:t>
+      </w:r>
+    </w:p>
+    <w:tbl>
+      <w:tblPr>
+        <w:tblW w:w="16578" w:type="dxa"/>
+        <w:tblCellSpacing w:w="15" w:type="dxa"/>
+        <w:tblBorders>
+          <w:top w:val="single" w:sz="2" w:space="0" w:color="auto"/>
+          <w:left w:val="single" w:sz="2" w:space="0" w:color="auto"/>
+          <w:bottom w:val="single" w:sz="2" w:space="0" w:color="auto"/>
+          <w:right w:val="single" w:sz="2" w:space="0" w:color="auto"/>
+        </w:tblBorders>
+        <w:tblCellMar>
+          <w:top w:w="15" w:type="dxa"/>
+          <w:left w:w="15" w:type="dxa"/>
+          <w:bottom w:w="15" w:type="dxa"/>
+          <w:right w:w="15" w:type="dxa"/>
+        </w:tblCellMar>
+        <w:tblLook w:val="04A0" w:firstRow="1" w:lastRow="0" w:firstColumn="1" w:lastColumn="0" w:noHBand="0" w:noVBand="1"/>
+      </w:tblPr>
+      <w:tblGrid>
+        <w:gridCol w:w="8031"/>
+        <w:gridCol w:w="4125"/>
+        <w:gridCol w:w="4422"/>
+      </w:tblGrid>
+      <w:tr>
+        <w:trPr>
+          <w:tblHeader/>
+          <w:tblCellSpacing w:w="15" w:type="dxa"/>
+        </w:trPr>
+        <w:tc>
+          <w:tcPr>
+            <w:tcW w:w="0" w:type="auto"/>
+            <w:tcBorders>
+              <w:top w:val="single" w:sz="2" w:space="0" w:color="1F1F1E"/>
+              <w:left w:val="single" w:sz="2" w:space="0" w:color="1F1F1E"/>
+              <w:bottom w:val="single" w:sz="2" w:space="0" w:color="1F1F1E"/>
+              <w:right w:val="single" w:sz="2" w:space="0" w:color="1F1F1E"/>
+            </w:tcBorders>
+            <w:noWrap/>
+            <w:tcMar>
+              <w:top w:w="90" w:type="dxa"/>
+              <w:left w:w="90" w:type="dxa"/>
+              <w:bottom w:w="90" w:type="dxa"/>
+              <w:right w:w="90" w:type="dxa"/>
+            </w:tcMar>
+            <w:hideMark/>
+          </w:tcPr>
+          <w:p>
+            <w:pPr>
+              <w:ind w:right="1199"/>
+            </w:pPr>
+            <w:r>
+              <w:t>User message</w:t>
+            </w:r>
+          </w:p>
+        </w:tc>
+        <w:tc>
+          <w:tcPr>
+            <w:tcW w:w="0" w:type="auto"/>
+            <w:tcBorders>
+              <w:top w:val="single" w:sz="2" w:space="0" w:color="1F1F1E"/>
+              <w:left w:val="single" w:sz="2" w:space="0" w:color="1F1F1E"/>
+              <w:bottom w:val="single" w:sz="2" w:space="0" w:color="1F1F1E"/>
+              <w:right w:val="single" w:sz="2" w:space="0" w:color="1F1F1E"/>
+            </w:tcBorders>
+            <w:noWrap/>
+            <w:tcMar>
+              <w:top w:w="90" w:type="dxa"/>
+              <w:left w:w="90" w:type="dxa"/>
+              <w:bottom w:w="90" w:type="dxa"/>
+              <w:right w:w="90" w:type="dxa"/>
+            </w:tcMar>
+            <w:hideMark/>
+          </w:tcPr>
+          <w:p>
+            <w:pPr>
+              <w:ind w:right="1199"/>
+            </w:pPr>
+            <w:r>
+              <w:t>safety regex hit</w:t>
+            </w:r>
+          </w:p>
+        </w:tc>
+        <w:tc>
+          <w:tcPr>
+            <w:tcW w:w="0" w:type="auto"/>
+            <w:tcBorders>
+              <w:top w:val="single" w:sz="2" w:space="0" w:color="1F1F1E"/>
+              <w:left w:val="single" w:sz="2" w:space="0" w:color="1F1F1E"/>
+              <w:bottom w:val="single" w:sz="2" w:space="0" w:color="1F1F1E"/>
+              <w:right w:val="single" w:sz="2" w:space="0" w:color="1F1F1E"/>
+            </w:tcBorders>
+            <w:noWrap/>
+            <w:tcMar>
+              <w:top w:w="90" w:type="dxa"/>
+              <w:left w:w="90" w:type="dxa"/>
+              <w:bottom w:w="90" w:type="dxa"/>
+              <w:right w:w="90" w:type="dxa"/>
+            </w:tcMar>
+            <w:hideMark/>
+          </w:tcPr>
+          <w:p>
+            <w:pPr>
+              <w:ind w:right="1199"/>
+            </w:pPr>
+            <w:r>
+              <w:t>Outcome</w:t>
+            </w:r>
+          </w:p>
+        </w:tc>
+      </w:tr>
+      <w:tr>
+        <w:trPr>
+          <w:tblCellSpacing w:w="15" w:type="dxa"/>
+        </w:trPr>
+        <w:tc>
+          <w:tcPr>
+            <w:tcW w:w="0" w:type="auto"/>
+            <w:tcBorders>
+              <w:top w:val="single" w:sz="2" w:space="0" w:color="1F1F1E"/>
+              <w:left w:val="single" w:sz="2" w:space="0" w:color="1F1F1E"/>
+              <w:bottom w:val="single" w:sz="2" w:space="0" w:color="1F1F1E"/>
+              <w:right w:val="single" w:sz="2" w:space="0" w:color="1F1F1E"/>
+            </w:tcBorders>
+            <w:tcMar>
+              <w:top w:w="90" w:type="dxa"/>
+              <w:left w:w="90" w:type="dxa"/>
+              <w:bottom w:w="90" w:type="dxa"/>
+              <w:right w:w="90" w:type="dxa"/>
+            </w:tcMar>
+            <w:hideMark/>
+          </w:tcPr>
+          <w:p>
+            <w:pPr>
+              <w:ind w:right="1199"/>
+            </w:pPr>
+            <w:r>
+              <w:t>"give me a status update on the project"</w:t>
+            </w:r>
+          </w:p>
+        </w:tc>
+        <w:tc>
+          <w:tcPr>
+            <w:tcW w:w="0" w:type="auto"/>
+            <w:tcBorders>
+              <w:top w:val="single" w:sz="2" w:space="0" w:color="1F1F1E"/>
+              <w:left w:val="single" w:sz="2" w:space="0" w:color="1F1F1E"/>
+              <w:bottom w:val="single" w:sz="2" w:space="0" w:color="1F1F1E"/>
+              <w:right w:val="single" w:sz="2" w:space="0" w:color="1F1F1E"/>
+            </w:tcBorders>
+            <w:tcMar>
+              <w:top w:w="90" w:type="dxa"/>
+              <w:left w:w="90" w:type="dxa"/>
+              <w:bottom w:w="90" w:type="dxa"/>
+              <w:right w:w="90" w:type="dxa"/>
+            </w:tcMar>
+            <w:hideMark/>
+          </w:tcPr>
+          <w:p>
+            <w:pPr>
+              <w:ind w:right="1199"/>
+            </w:pPr>
+            <w:r>
+              <w:t>update</w:t>
+            </w:r>
+          </w:p>
+        </w:tc>
+        <w:tc>
+          <w:tcPr>
+            <w:tcW w:w="0" w:type="auto"/>
+            <w:tcBorders>
+              <w:top w:val="single" w:sz="2" w:space="0" w:color="1F1F1E"/>
+              <w:left w:val="single" w:sz="2" w:space="0" w:color="1F1F1E"/>
+              <w:bottom w:val="single" w:sz="2" w:space="0" w:color="1F1F1E"/>
+              <w:right w:val="single" w:sz="2" w:space="0" w:color="1F1F1E"/>
+            </w:tcBorders>
+            <w:tcMar>
+              <w:top w:w="90" w:type="dxa"/>
+              <w:left w:w="90" w:type="dxa"/>
+              <w:bottom w:w="90" w:type="dxa"/>
+              <w:right w:w="90" w:type="dxa"/>
+            </w:tcMar>
+            <w:hideMark/>
+          </w:tcPr>
+          <w:p>
+            <w:pPr>
+              <w:ind w:right="1199"/>
+            </w:pPr>
+            <w:r>
+              <w:t>409 / no recovery</w:t>
+            </w:r>
+          </w:p>
+        </w:tc>
+      </w:tr>
+      <w:tr>
+        <w:trPr>
+          <w:tblCellSpacing w:w="15" w:type="dxa"/>
+        </w:trPr>
+        <w:tc>
+          <w:tcPr>
+            <w:tcW w:w="0" w:type="auto"/>
+            <w:tcBorders>
+              <w:top w:val="single" w:sz="2" w:space="0" w:color="1F1F1E"/>
+              <w:left w:val="single" w:sz="2" w:space="0" w:color="1F1F1E"/>
+              <w:bottom w:val="single" w:sz="2" w:space="0" w:color="1F1F1E"/>
+              <w:right w:val="single" w:sz="2" w:space="0" w:color="1F1F1E"/>
+            </w:tcBorders>
+            <w:tcMar>
+              <w:top w:w="90" w:type="dxa"/>
+              <w:left w:w="90" w:type="dxa"/>
+              <w:bottom w:w="90" w:type="dxa"/>
+              <w:right w:w="90" w:type="dxa"/>
+            </w:tcMar>
+            <w:hideMark/>
+          </w:tcPr>
+          <w:p>
+            <w:pPr>
+              <w:ind w:right="1199"/>
+            </w:pPr>
+            <w:r>
+              <w:t>"save a draft of this for me"</w:t>
+            </w:r>
+          </w:p>
+        </w:tc>
+        <w:tc>
+          <w:tcPr>
+            <w:tcW w:w="0" w:type="auto"/>
+            <w:tcBorders>
+              <w:top w:val="single" w:sz="2" w:space="0" w:color="1F1F1E"/>
+              <w:left w:val="single" w:sz="2" w:space="0" w:color="1F1F1E"/>
+              <w:bottom w:val="single" w:sz="2" w:space="0" w:color="1F1F1E"/>
+              <w:right w:val="single" w:sz="2" w:space="0" w:color="1F1F1E"/>
+            </w:tcBorders>
+            <w:tcMar>
+              <w:top w:w="90" w:type="dxa"/>
+              <w:left w:w="90" w:type="dxa"/>
+              <w:bottom w:w="90" w:type="dxa"/>
+              <w:right w:w="90" w:type="dxa"/>
+            </w:tcMar>
+            <w:hideMark/>
+          </w:tcPr>
+          <w:p>
+            <w:pPr>
+              <w:ind w:right="1199"/>
+            </w:pPr>
+            <w:r>
+              <w:t>save</w:t>
+            </w:r>
+          </w:p>
+        </w:tc>
+        <w:tc>
+          <w:tcPr>
+            <w:tcW w:w="0" w:type="auto"/>
+            <w:tcBorders>
+              <w:top w:val="single" w:sz="2" w:space="0" w:color="1F1F1E"/>
+              <w:left w:val="single" w:sz="2" w:space="0" w:color="1F1F1E"/>
+              <w:bottom w:val="single" w:sz="2" w:space="0" w:color="1F1F1E"/>
+              <w:right w:val="single" w:sz="2" w:space="0" w:color="1F1F1E"/>
+            </w:tcBorders>
+            <w:tcMar>
+              <w:top w:w="90" w:type="dxa"/>
+              <w:left w:w="90" w:type="dxa"/>
+              <w:bottom w:w="90" w:type="dxa"/>
+              <w:right w:w="90" w:type="dxa"/>
+            </w:tcMar>
+            <w:hideMark/>
+          </w:tcPr>
+          <w:p>
+            <w:pPr>
+              <w:ind w:right="1199"/>
+            </w:pPr>
+            <w:r>
+              <w:t>409 / no recovery</w:t>
+            </w:r>
+          </w:p>
+        </w:tc>
+      </w:tr>
+      <w:tr>
+        <w:trPr>
+          <w:tblCellSpacing w:w="15" w:type="dxa"/>
+        </w:trPr>
+        <w:tc>
+          <w:tcPr>
+            <w:tcW w:w="0" w:type="auto"/>
+            <w:tcBorders>
+              <w:top w:val="single" w:sz="2" w:space="0" w:color="1F1F1E"/>
+              <w:left w:val="single" w:sz="2" w:space="0" w:color="1F1F1E"/>
+              <w:bottom w:val="single" w:sz="2" w:space="0" w:color="1F1F1E"/>
+              <w:right w:val="single" w:sz="2" w:space="0" w:color="1F1F1E"/>
+            </w:tcBorders>
+            <w:tcMar>
+              <w:top w:w="90" w:type="dxa"/>
+              <w:left w:w="90" w:type="dxa"/>
+              <w:bottom w:w="90" w:type="dxa"/>
+              <w:right w:w="90" w:type="dxa"/>
+            </w:tcMar>
+            <w:hideMark/>
+          </w:tcPr>
+          <w:p>
+            <w:pPr>
+              <w:ind w:right="1199"/>
+            </w:pPr>
+            <w:r>
+              <w:t>"create a one-line summary"</w:t>
+            </w:r>
+          </w:p>
+        </w:tc>
+        <w:tc>
+          <w:tcPr>
+            <w:tcW w:w="0" w:type="auto"/>
+            <w:tcBorders>
+              <w:top w:val="single" w:sz="2" w:space="0" w:color="1F1F1E"/>
+              <w:left w:val="single" w:sz="2" w:space="0" w:color="1F1F1E"/>
+              <w:bottom w:val="single" w:sz="2" w:space="0" w:color="1F1F1E"/>
+              <w:right w:val="single" w:sz="2" w:space="0" w:color="1F1F1E"/>
+            </w:tcBorders>
+            <w:tcMar>
+              <w:top w:w="90" w:type="dxa"/>
+              <w:left w:w="90" w:type="dxa"/>
+              <w:bottom w:w="90" w:type="dxa"/>
+              <w:right w:w="90" w:type="dxa"/>
+            </w:tcMar>
+            <w:hideMark/>
+          </w:tcPr>
+          <w:p>
+            <w:pPr>
+              <w:ind w:right="1199"/>
+            </w:pPr>
+            <w:r>
+              <w:t>create</w:t>
+            </w:r>
+          </w:p>
+        </w:tc>
+        <w:tc>
+          <w:tcPr>
+            <w:tcW w:w="0" w:type="auto"/>
+            <w:tcBorders>
+              <w:top w:val="single" w:sz="2" w:space="0" w:color="1F1F1E"/>
+              <w:left w:val="single" w:sz="2" w:space="0" w:color="1F1F1E"/>
+              <w:bottom w:val="single" w:sz="2" w:space="0" w:color="1F1F1E"/>
+              <w:right w:val="single" w:sz="2" w:space="0" w:color="1F1F1E"/>
+            </w:tcBorders>
+            <w:tcMar>
+              <w:top w:w="90" w:type="dxa"/>
+              <w:left w:w="90" w:type="dxa"/>
+              <w:bottom w:w="90" w:type="dxa"/>
+              <w:right w:w="90" w:type="dxa"/>
+            </w:tcMar>
+            <w:hideMark/>
+          </w:tcPr>
+          <w:p>
+            <w:pPr>
+              <w:ind w:right="1199"/>
+            </w:pPr>
+            <w:r>
+              <w:t>409 / no recovery</w:t>
+            </w:r>
+          </w:p>
+        </w:tc>
+      </w:tr>
+      <w:tr>
+        <w:trPr>
+          <w:tblCellSpacing w:w="15" w:type="dxa"/>
+        </w:trPr>
+        <w:tc>
+          <w:tcPr>
+            <w:tcW w:w="0" w:type="auto"/>
+            <w:tcBorders>
+              <w:top w:val="single" w:sz="2" w:space="0" w:color="1F1F1E"/>
+              <w:left w:val="single" w:sz="2" w:space="0" w:color="1F1F1E"/>
+              <w:bottom w:val="single" w:sz="2" w:space="0" w:color="1F1F1E"/>
+              <w:right w:val="single" w:sz="2" w:space="0" w:color="1F1F1E"/>
+            </w:tcBorders>
+            <w:tcMar>
+              <w:top w:w="90" w:type="dxa"/>
+              <w:left w:w="90" w:type="dxa"/>
+              <w:bottom w:w="90" w:type="dxa"/>
+              <w:right w:w="90" w:type="dxa"/>
+            </w:tcMar>
+            <w:hideMark/>
+          </w:tcPr>
+          <w:p>
+            <w:pPr>
+              <w:ind w:right="1199"/>
+            </w:pPr>
+            <w:r>
+              <w:t>"delete the second paragraph from this draft"</w:t>
+            </w:r>
+          </w:p>
+        </w:tc>
+        <w:tc>
+          <w:tcPr>
+            <w:tcW w:w="0" w:type="auto"/>
+            <w:tcBorders>
+              <w:top w:val="single" w:sz="2" w:space="0" w:color="1F1F1E"/>
+              <w:left w:val="single" w:sz="2" w:space="0" w:color="1F1F1E"/>
+              <w:bottom w:val="single" w:sz="2" w:space="0" w:color="1F1F1E"/>
+              <w:right w:val="single" w:sz="2" w:space="0" w:color="1F1F1E"/>
+            </w:tcBorders>
+            <w:tcMar>
+              <w:top w:w="90" w:type="dxa"/>
+              <w:left w:w="90" w:type="dxa"/>
+              <w:bottom w:w="90" w:type="dxa"/>
+              <w:right w:w="90" w:type="dxa"/>
+            </w:tcMar>
+            <w:hideMark/>
+          </w:tcPr>
+          <w:p>
+            <w:pPr>
+              <w:ind w:right="1199"/>
+            </w:pPr>
+            <w:r>
+              <w:t>delete</w:t>
+            </w:r>
+          </w:p>
+        </w:tc>
+        <w:tc>
+          <w:tcPr>
+            <w:tcW w:w="0" w:type="auto"/>
+            <w:tcBorders>
+              <w:top w:val="single" w:sz="2" w:space="0" w:color="1F1F1E"/>
+              <w:left w:val="single" w:sz="2" w:space="0" w:color="1F1F1E"/>
+              <w:bottom w:val="single" w:sz="2" w:space="0" w:color="1F1F1E"/>
+              <w:right w:val="single" w:sz="2" w:space="0" w:color="1F1F1E"/>
+            </w:tcBorders>
+            <w:tcMar>
+              <w:top w:w="90" w:type="dxa"/>
+              <w:left w:w="90" w:type="dxa"/>
+              <w:bottom w:w="90" w:type="dxa"/>
+              <w:right w:w="90" w:type="dxa"/>
+            </w:tcMar>
+            <w:hideMark/>
+          </w:tcPr>
+          <w:p>
+            <w:pPr>
+              <w:ind w:right="1199"/>
+            </w:pPr>
+            <w:r>
+              <w:t>409 / no recovery</w:t>
+            </w:r>
+          </w:p>
+        </w:tc>
+      </w:tr>
+    </w:tbl>
+    <w:p>
+      <w:pPr>
+        <w:ind w:right="1199"/>
+      </w:pPr>
+      <w:r>
+        <w:t>The route test even validates this behavior: "write a short update" returns 409 CONFIRM_ONCE. Client-side </w:t>
+      </w:r>
+      <w:hyperlink r:id="rId25" w:tgtFrame="_blank" w:history="1">
+        <w:r>
+          <w:rPr>
+            <w:rStyle w:val="Hyperlink"/>
+          </w:rPr>
+          <w:t>page.tsx</w:t>
+        </w:r>
+      </w:hyperlink>
+      <w:r>
+        <w:t> treats !res.ok as a generic error ("Request failed (409). Please try again.") — but a retry produces the same 409 because there is no confirmation field in </w:t>
+      </w:r>
+      <w:hyperlink r:id="rId26" w:tgtFrame="_blank" w:history="1">
+        <w:r>
+          <w:rPr>
+            <w:rStyle w:val="Hyperlink"/>
+          </w:rPr>
+          <w:t>ChatRequestSchema</w:t>
+        </w:r>
+      </w:hyperlink>
+      <w:r>
+        <w:t>. There is no path through the gate.</w:t>
+      </w:r>
+    </w:p>
+    <w:p>
+      <w:pPr>
+        <w:ind w:right="1199"/>
+      </w:pPr>
+      <w:r>
+        <w:t>The architectural mistake is conflating "this language pattern is risky" with "this request is risky." Today the chat endpoint produces text. No action. No filesystem. No external write. The safety tag should be carried forward as routing metadata for the eventual tool runner, not gate the chat itself.</w:t>
+      </w:r>
+    </w:p>
+    <w:p>
+      <w:pPr>
+        <w:ind w:right="1199"/>
+      </w:pPr>
+      <w:r>
+        <w:t>Fix (smallest, correct): in </w:t>
+      </w:r>
+      <w:hyperlink r:id="rId27" w:tgtFrame="_blank" w:history="1">
+        <w:r>
+          <w:rPr>
+            <w:rStyle w:val="Hyperlink"/>
+          </w:rPr>
+          <w:t>enforcement.ts</w:t>
+        </w:r>
+      </w:hyperlink>
+      <w:r>
+        <w:t>, only block on BLOCK. For CONFIRM_ONCE / CONFIRM_ALWAYS, allow the chat through, attach the tag to the model context, and log it. When Phase 2 tools land, the tool runner consults the tag and gates </w:t>
+      </w:r>
+      <w:r>
+        <w:rPr>
+          <w:i/>
+          <w:iCs/>
+        </w:rPr>
+        <w:t>execution</w:t>
+      </w:r>
+      <w:r>
+        <w:t>, not </w:t>
+      </w:r>
+      <w:r>
+        <w:rPr>
+          <w:i/>
+          <w:iCs/>
+        </w:rPr>
+        <w:t>the conversation</w:t>
+      </w:r>
+      <w:r>
+        <w:t>.</w:t>
+      </w:r>
+    </w:p>
+    <w:p>
+      <w:pPr>
+        <w:ind w:right="1199"/>
+      </w:pPr>
+      <w:r>
+        <w:t>Why P0: until this changes, every commit lives behind a hidden minefield of vocabulary regexes. Demoing the system today is a coin flip.</w:t>
+      </w:r>
+    </w:p>
+    <w:p>
+      <w:pPr>
+        <w:ind w:right="1199"/>
+      </w:pPr>
+      <w:r>
+        <w:t>2. Tools self-declare safety; nothing enforces it.</w:t>
+      </w:r>
+    </w:p>
+    <w:p>
+      <w:pPr>
+        <w:ind w:right="1199"/>
+      </w:pPr>
+      <w:hyperlink r:id="rId28" w:tgtFrame="_blank" w:history="1">
+        <w:r>
+          <w:rPr>
+            <w:rStyle w:val="Hyperlink"/>
+          </w:rPr>
+          <w:t>tools/types.ts:13-19</w:t>
+        </w:r>
+      </w:hyperlink>
+      <w:r>
+        <w:t> — Tool.requiredSafetyTag: SafetyTag exists. Good design. But </w:t>
+      </w:r>
+      <w:hyperlink r:id="rId29" w:tgtFrame="_blank" w:history="1">
+        <w:r>
+          <w:rPr>
+            <w:rStyle w:val="Hyperlink"/>
+          </w:rPr>
+          <w:t>registry.ts</w:t>
+        </w:r>
+      </w:hyperlink>
+      <w:r>
+        <w:t> is just a Map.get — nothing compares the tool's required tag against the router's decision before tool.execute() is called. Before any real tool lands, you need a tool runner as the only legal way to invoke a tool:</w:t>
+      </w:r>
+    </w:p>
+    <w:p>
+      <w:pPr>
+        <w:ind w:right="1199"/>
+      </w:pPr>
+      <w:r>
+        <w:t>runTool(toolId, input, { decision, requestId, signal })</w:t>
+      </w:r>
+    </w:p>
+    <w:p>
+      <w:pPr>
+        <w:ind w:right="1199"/>
+      </w:pPr>
+      <w:r>
+        <w:t xml:space="preserve">  → compares tool.requiredSafetyTag vs decision.safety.safetyTag</w:t>
+      </w:r>
+    </w:p>
+    <w:p>
+      <w:pPr>
+        <w:ind w:right="1199"/>
+      </w:pPr>
+      <w:r>
+        <w:t xml:space="preserve">  → returns ToolPermissionDenied | ToolResult</w:t>
+      </w:r>
+    </w:p>
+    <w:p>
+      <w:pPr>
+        <w:ind w:right="1199"/>
+      </w:pPr>
+      <w:r>
+        <w:t xml:space="preserve">  → records a tool_calls telemetry row either way</w:t>
+      </w:r>
+    </w:p>
+    <w:p>
+      <w:pPr>
+        <w:ind w:right="1199"/>
+      </w:pPr>
+      <w:r>
+        <w:t xml:space="preserve">If anyone calls tools.get(id).execute(...) directly, the safety contract is bypassed silently. Make that path discouraged at the type level (or wrap execute so it can't be called without a runner-issued capability token). </w:t>
+      </w:r>
+      <w:r>
+        <w:lastRenderedPageBreak/>
+        <w:t>The simplest move: keep Tool.execute available but have the runner be the only consumer that calls it; add a one-line comment in Tool.execute saying "do not call directly — use runTool".</w:t>
+      </w:r>
+    </w:p>
+    <w:p>
+      <w:pPr>
+        <w:ind w:right="1199"/>
+      </w:pPr>
+      <w:r>
+        <w:t>3. ToolContext lacks an AbortSignal and a timeout contract.</w:t>
+      </w:r>
+    </w:p>
+    <w:p>
+      <w:pPr>
+        <w:ind w:right="1199"/>
+      </w:pPr>
+      <w:hyperlink r:id="rId30" w:tgtFrame="_blank" w:history="1">
+        <w:r>
+          <w:rPr>
+            <w:rStyle w:val="Hyperlink"/>
+          </w:rPr>
+          <w:t>tools/types.ts:3-5</w:t>
+        </w:r>
+      </w:hyperlink>
+      <w:r>
+        <w:t> — ToolContext = { requestId: string }. The mock returns instantly. A filesystem read can hang. A subprocess can take forever. A network tool can stall.</w:t>
+      </w:r>
+    </w:p>
+    <w:p>
+      <w:pPr>
+        <w:ind w:right="1199"/>
+      </w:pPr>
+      <w:r>
+        <w:t>Add signal: AbortSignal and an explicit per-tool timeoutMs declaration before any real tool ships. The route already creates an AbortController (ac in </w:t>
+      </w:r>
+      <w:hyperlink r:id="rId31" w:tgtFrame="_blank" w:history="1">
+        <w:r>
+          <w:rPr>
+            <w:rStyle w:val="Hyperlink"/>
+          </w:rPr>
+          <w:t>route.ts:184</w:t>
+        </w:r>
+      </w:hyperlink>
+      <w:r>
+        <w:t>) — that signal should propagate to tool calls the same way it does to the provider.</w:t>
+      </w:r>
+    </w:p>
+    <w:p>
+      <w:pPr>
+        <w:ind w:right="1199"/>
+      </w:pPr>
+      <w:r>
+        <w:t>4. No persistence table for tool calls.</w:t>
+      </w:r>
+    </w:p>
+    <w:p>
+      <w:pPr>
+        <w:ind w:right="1199"/>
+      </w:pPr>
+      <w:r>
+        <w:t>The eval framework got its own tables (eval_runs, eval_results) which is exactly the pattern Phase 2 needs. Tools need the same:</w:t>
+      </w:r>
+    </w:p>
+    <w:p>
+      <w:pPr>
+        <w:ind w:right="1199"/>
+      </w:pPr>
+      <w:r>
+        <w:t>CREATE TABLE tool_calls (</w:t>
+      </w:r>
+    </w:p>
+    <w:p>
+      <w:pPr>
+        <w:ind w:right="1199"/>
+      </w:pPr>
+      <w:r>
+        <w:t xml:space="preserve">  id            TEXT PRIMARY KEY,</w:t>
+      </w:r>
+    </w:p>
+    <w:p>
+      <w:pPr>
+        <w:ind w:right="1199"/>
+      </w:pPr>
+      <w:r>
+        <w:t xml:space="preserve">  session_id    TEXT NOT NULL,</w:t>
+      </w:r>
+    </w:p>
+    <w:p>
+      <w:pPr>
+        <w:ind w:right="1199"/>
+      </w:pPr>
+      <w:r>
+        <w:t xml:space="preserve">  tool_id       TEXT NOT NULL,</w:t>
+      </w:r>
+    </w:p>
+    <w:p>
+      <w:pPr>
+        <w:ind w:right="1199"/>
+      </w:pPr>
+      <w:r>
+        <w:t xml:space="preserve">  input         TEXT NOT NULL,        </w:t>
+      </w:r>
+      <w:r>
+        <w:rPr>
+          <w:i/>
+          <w:iCs/>
+        </w:rPr>
+        <w:t>-- JSON</w:t>
+      </w:r>
+    </w:p>
+    <w:p>
+      <w:pPr>
+        <w:ind w:right="1199"/>
+      </w:pPr>
+      <w:r>
+        <w:t xml:space="preserve">  result        TEXT,                  </w:t>
+      </w:r>
+      <w:r>
+        <w:rPr>
+          <w:i/>
+          <w:iCs/>
+        </w:rPr>
+        <w:t>-- JSON, nullable on denial/error</w:t>
+      </w:r>
+    </w:p>
+    <w:p>
+      <w:pPr>
+        <w:ind w:right="1199"/>
+      </w:pPr>
+      <w:r>
+        <w:t xml:space="preserve">  ok            INTEGER NOT NULL,</w:t>
+      </w:r>
+    </w:p>
+    <w:p>
+      <w:pPr>
+        <w:ind w:right="1199"/>
+      </w:pPr>
+      <w:r>
+        <w:t xml:space="preserve">  safety_tag    TEXT NOT NULL,</w:t>
+      </w:r>
+    </w:p>
+    <w:p>
+      <w:pPr>
+        <w:ind w:right="1199"/>
+      </w:pPr>
+      <w:r>
+        <w:t xml:space="preserve">  intent        TEXT,</w:t>
+      </w:r>
+    </w:p>
+    <w:p>
+      <w:pPr>
+        <w:ind w:right="1199"/>
+      </w:pPr>
+      <w:r>
+        <w:t xml:space="preserve">  started_at    INTEGER NOT NULL,</w:t>
+      </w:r>
+    </w:p>
+    <w:p>
+      <w:pPr>
+        <w:ind w:right="1199"/>
+      </w:pPr>
+      <w:r>
+        <w:t xml:space="preserve">  completed_at  INTEGER,</w:t>
+      </w:r>
+    </w:p>
+    <w:p>
+      <w:pPr>
+        <w:ind w:right="1199"/>
+      </w:pPr>
+      <w:r>
+        <w:t xml:space="preserve">  error_class   TEXT,</w:t>
+      </w:r>
+    </w:p>
+    <w:p>
+      <w:pPr>
+        <w:ind w:right="1199"/>
+      </w:pPr>
+      <w:r>
+        <w:t xml:space="preserve">  error_message TEXT</w:t>
+      </w:r>
+    </w:p>
+    <w:p>
+      <w:pPr>
+        <w:ind w:right="1199"/>
+      </w:pPr>
+      <w:r>
+        <w:t>);</w:t>
+      </w:r>
+    </w:p>
+    <w:p>
+      <w:pPr>
+        <w:ind w:right="1199"/>
+      </w:pPr>
+      <w:r>
+        <w:t>Without this, the first time a tool misbehaves you have no audit trail. Land the schema before the first real tool, not after.</w:t>
+      </w:r>
+    </w:p>
+    <w:p>
+      <w:pPr>
+        <w:ind w:right="1199"/>
+      </w:pPr>
+      <w:r>
+        <w:t>5. Decide the tool-execution runtime now.</w:t>
+      </w:r>
+    </w:p>
+    <w:p>
+      <w:pPr>
+        <w:ind w:right="1199"/>
+      </w:pPr>
+      <w:hyperlink r:id="rId32" w:tgtFrame="_blank" w:history="1">
+        <w:r>
+          <w:rPr>
+            <w:rStyle w:val="Hyperlink"/>
+          </w:rPr>
+          <w:t>ARCHITECTURE.md §0</w:t>
+        </w:r>
+      </w:hyperlink>
+      <w:r>
+        <w:t> says "Electron shell adopted in Phase 2." Until the shell exists, tools will run inside the Next route process. That's fine on localhost, dangerous if the dev server is ever exposed (e.g., next dev --hostname 0.0.0.0 for mobile testing). Before tools land, decide one of:</w:t>
+      </w:r>
+    </w:p>
+    <w:p>
+      <w:pPr>
+        <w:numPr>
+          <w:ilvl w:val="0"/>
+          <w:numId w:val="24"/>
+        </w:numPr>
+        <w:ind w:right="1199"/>
+      </w:pPr>
+      <w:r>
+        <w:t>a) Tools live in the current Next route process. Document that the server must never bind to a non-loopback interface. Add a boot-time check that refuses to start if HOSTNAME is 0.0.0.0 and NODE_ENV !== "development", or similar.</w:t>
+      </w:r>
+    </w:p>
+    <w:p>
+      <w:pPr>
+        <w:numPr>
+          <w:ilvl w:val="0"/>
+          <w:numId w:val="24"/>
+        </w:numPr>
+        <w:ind w:right="1199"/>
+      </w:pPr>
+      <w:r>
+        <w:lastRenderedPageBreak/>
+        <w:t>b) Tools live in a separate Node sidecar reached over localhost: from the Next route. Slower path, but the route can't fs.unlink.</w:t>
+      </w:r>
+    </w:p>
+    <w:p>
+      <w:pPr>
+        <w:numPr>
+          <w:ilvl w:val="0"/>
+          <w:numId w:val="24"/>
+        </w:numPr>
+        <w:ind w:right="1199"/>
+      </w:pPr>
+      <w:r>
+        <w:t>c) Tools live in the Electron main process; the Next route proxies via IPC. The strongest isolation; the most work.</w:t>
+      </w:r>
+    </w:p>
+    <w:p>
+      <w:pPr>
+        <w:ind w:right="1199"/>
+      </w:pPr>
+      <w:r>
+        <w:t>(a) is fine for now if explicitly bounded. Pick one. Without a decision, when Phase 2 lands the answer will be "whatever was easiest," and you'll have a filesystem tool inside an HTTP route on the same port as the chat UI.</w:t>
+      </w:r>
+    </w:p>
+    <w:p>
+      <w:pPr>
+        <w:ind w:right="1199"/>
+      </w:pPr>
+      <w:r>
+        <w:t>6. Providers don't emit tool_call_* events; the route doesn't act on them.</w:t>
+      </w:r>
+    </w:p>
+    <w:p>
+      <w:pPr>
+        <w:ind w:right="1199"/>
+      </w:pPr>
+      <w:hyperlink r:id="rId33" w:tgtFrame="_blank" w:history="1">
+        <w:r>
+          <w:rPr>
+            <w:rStyle w:val="Hyperlink"/>
+          </w:rPr>
+          <w:t>providers/types.ts</w:t>
+        </w:r>
+      </w:hyperlink>
+      <w:r>
+        <w:t> has reserved tool_call_start | tool_call_delta | tool_call_end slots in StreamEvent. Neither provider yields them. Neither does the route's stream loop handle them. Neither does GenerateOptions accept a tools array.</w:t>
+      </w:r>
+    </w:p>
+    <w:p>
+      <w:pPr>
+        <w:ind w:right="1199"/>
+      </w:pPr>
+      <w:r>
+        <w:t>For Phase 2 tools to work via LLM function-calling, all four must land together:</w:t>
+      </w:r>
+    </w:p>
+    <w:p>
+      <w:pPr>
+        <w:numPr>
+          <w:ilvl w:val="0"/>
+          <w:numId w:val="25"/>
+        </w:numPr>
+        <w:ind w:right="1199"/>
+      </w:pPr>
+      <w:r>
+        <w:t>GenerateOptions.tools?: ToolSpec[] (provider-agnostic schema)</w:t>
+      </w:r>
+    </w:p>
+    <w:p>
+      <w:pPr>
+        <w:numPr>
+          <w:ilvl w:val="0"/>
+          <w:numId w:val="25"/>
+        </w:numPr>
+        <w:ind w:right="1199"/>
+      </w:pPr>
+      <w:r>
+        <w:t>OpenAI provider: maps tools → chat.completions tools param; maps tool_calls deltas → StreamEvent</w:t>
+      </w:r>
+    </w:p>
+    <w:p>
+      <w:pPr>
+        <w:numPr>
+          <w:ilvl w:val="0"/>
+          <w:numId w:val="25"/>
+        </w:numPr>
+        <w:ind w:right="1199"/>
+      </w:pPr>
+      <w:r>
+        <w:t>Anthropic provider: maps tools → messages API tools param; maps content_block of tool_use type → StreamEvent</w:t>
+      </w:r>
+    </w:p>
+    <w:p>
+      <w:pPr>
+        <w:numPr>
+          <w:ilvl w:val="0"/>
+          <w:numId w:val="25"/>
+        </w:numPr>
+        <w:ind w:right="1199"/>
+      </w:pPr>
+      <w:r>
+        <w:t>Route: on tool_call_end, hands the assembled call to the tool runner (which respects </w:t>
+      </w:r>
+      <w:hyperlink r:id="rId34" w:tgtFrame="_blank" w:history="1">
+        <w:r>
+          <w:rPr>
+            <w:rStyle w:val="Hyperlink"/>
+          </w:rPr>
+          <w:t>#2</w:t>
+        </w:r>
+      </w:hyperlink>
+      <w:r>
+        <w:t> and </w:t>
+      </w:r>
+      <w:hyperlink r:id="rId35" w:tgtFrame="_blank" w:history="1">
+        <w:r>
+          <w:rPr>
+            <w:rStyle w:val="Hyperlink"/>
+          </w:rPr>
+          <w:t>#3</w:t>
+        </w:r>
+      </w:hyperlink>
+      <w:r>
+        <w:t>), feeds the result back into the conversation, resumes streaming</w:t>
+      </w:r>
+    </w:p>
+    <w:p>
+      <w:pPr>
+        <w:ind w:right="1199"/>
+      </w:pPr>
+      <w:r>
+        <w:t>The current stream loop doesn't have a "resume after tool result" branch. That's a substantial route refactor; better to plan it as a single phase, not a bolt-on.</w:t>
+      </w:r>
+    </w:p>
+    <w:p>
+      <w:pPr>
+        <w:ind w:right="1199"/>
+      </w:pPr>
+      <w:r>
+        <w:pict w14:anchorId="0760AFEF">
+          <v:rect id="_x0000_i1050" style="width:0;height:0" o:hralign="center" o:hrstd="t" o:hr="t" fillcolor="#a0a0a0" stroked="f"/>
+        </w:pict>
+      </w:r>
+    </w:p>
+    <w:p>
+      <w:pPr>
+        <w:ind w:right="1199"/>
+      </w:pPr>
+      <w:r>
+        <w:t>P1 — Architectural debt that compounds if ignored</w:t>
+      </w:r>
+    </w:p>
+    <w:p>
+      <w:pPr>
+        <w:ind w:right="1199"/>
+      </w:pPr>
+      <w:r>
+        <w:t>7. The router is single-turn only.</w:t>
+      </w:r>
+    </w:p>
+    <w:p>
+      <w:pPr>
+        <w:ind w:right="1199"/>
+      </w:pPr>
+      <w:hyperlink r:id="rId36" w:tgtFrame="_blank" w:history="1">
+        <w:r>
+          <w:rPr>
+            <w:rStyle w:val="Hyperlink"/>
+          </w:rPr>
+          <w:t>intent.ts:4</w:t>
+        </w:r>
+      </w:hyperlink>
+      <w:r>
+        <w:t> and </w:t>
+      </w:r>
+      <w:hyperlink r:id="rId37" w:tgtFrame="_blank" w:history="1">
+        <w:r>
+          <w:rPr>
+            <w:rStyle w:val="Hyperlink"/>
+          </w:rPr>
+          <w:t>safety.ts:4</w:t>
+        </w:r>
+      </w:hyperlink>
+      <w:r>
+        <w:t> both call latestUserText(messages) — only the most recent user message is classified. Multi-turn behavior breaks:</w:t>
+      </w:r>
+    </w:p>
+    <w:p>
+      <w:pPr>
+        <w:numPr>
+          <w:ilvl w:val="0"/>
+          <w:numId w:val="26"/>
+        </w:numPr>
+        <w:ind w:right="1199"/>
+      </w:pPr>
+      <w:r>
+        <w:t>Conversation: "delete the second paragraph" → 409 → user follows up with "yes do it" → "yes do it" classifies as AMBIGUOUS / ALLOW, bypasses the original safety concern.</w:t>
+      </w:r>
+    </w:p>
+    <w:p>
+      <w:pPr>
+        <w:numPr>
+          <w:ilvl w:val="0"/>
+          <w:numId w:val="26"/>
+        </w:numPr>
+        <w:ind w:right="1199"/>
+      </w:pPr>
+      <w:r>
+        <w:t>Same for confirmation flows: there's no way the classifier can tell "yes" relates to the prior risky request.</w:t>
+      </w:r>
+    </w:p>
+    <w:p>
+      <w:pPr>
+        <w:ind w:right="1199"/>
+      </w:pPr>
+      <w:r>
+        <w:t>When Phase 2 ships, the classifier needs at minimum: the last assistant turn (to detect "you asked, here's the action") and an explicit per-session "pending safety decision" slot. v3.1 §14 already calls for "ask once per session/project" semantics — that requires session-scoped router state.</w:t>
+      </w:r>
+    </w:p>
+    <w:p>
+      <w:pPr>
+        <w:ind w:right="1199"/>
+      </w:pPr>
+      <w:r>
+        <w:t>8. The client.ts / client-node.ts / index.ts / node.ts split for the DB layer is one entry point too many.</w:t>
+      </w:r>
+    </w:p>
+    <w:p>
+      <w:pPr>
+        <w:ind w:right="1199"/>
+      </w:pPr>
+      <w:r>
+        <w:t>After the refactor, the DB has:</w:t>
+      </w:r>
+    </w:p>
+    <w:p>
+      <w:pPr>
+        <w:numPr>
+          <w:ilvl w:val="0"/>
+          <w:numId w:val="27"/>
+        </w:numPr>
+        <w:ind w:right="1199"/>
+      </w:pPr>
+      <w:hyperlink r:id="rId38" w:tgtFrame="_blank" w:history="1">
+        <w:r>
+          <w:rPr>
+            <w:rStyle w:val="Hyperlink"/>
+          </w:rPr>
+          <w:t>client-node.ts</w:t>
+        </w:r>
+      </w:hyperlink>
+      <w:r>
+        <w:t> — pure singleton (real)</w:t>
+      </w:r>
+    </w:p>
+    <w:p>
+      <w:pPr>
+        <w:numPr>
+          <w:ilvl w:val="0"/>
+          <w:numId w:val="27"/>
+        </w:numPr>
+        <w:ind w:right="1199"/>
+      </w:pPr>
+      <w:hyperlink r:id="rId39" w:tgtFrame="_blank" w:history="1">
+        <w:r>
+          <w:rPr>
+            <w:rStyle w:val="Hyperlink"/>
+          </w:rPr>
+          <w:t>client.ts</w:t>
+        </w:r>
+      </w:hyperlink>
+      <w:r>
+        <w:t> — server-only re-export of client-node</w:t>
+      </w:r>
+    </w:p>
+    <w:p>
+      <w:pPr>
+        <w:numPr>
+          <w:ilvl w:val="0"/>
+          <w:numId w:val="27"/>
+        </w:numPr>
+        <w:ind w:right="1199"/>
+      </w:pPr>
+      <w:hyperlink r:id="rId40" w:tgtFrame="_blank" w:history="1">
+        <w:r>
+          <w:rPr>
+            <w:rStyle w:val="Hyperlink"/>
+          </w:rPr>
+          <w:t>index.ts</w:t>
+        </w:r>
+      </w:hyperlink>
+      <w:r>
+        <w:t> — server-only barrel that re-exports client-node directly (note: imports from ./client-node, not ./client)</w:t>
+      </w:r>
+    </w:p>
+    <w:p>
+      <w:pPr>
+        <w:numPr>
+          <w:ilvl w:val="0"/>
+          <w:numId w:val="27"/>
+        </w:numPr>
+        <w:ind w:right="1199"/>
+      </w:pPr>
+      <w:hyperlink r:id="rId41" w:tgtFrame="_blank" w:history="1">
+        <w:r>
+          <w:rPr>
+            <w:rStyle w:val="Hyperlink"/>
+          </w:rPr>
+          <w:t>node.ts</w:t>
+        </w:r>
+      </w:hyperlink>
+      <w:r>
+        <w:t> — server-only re-export of getDb/closeDb from client-node</w:t>
+      </w:r>
+    </w:p>
+    <w:p>
+      <w:pPr>
+        <w:ind w:right="1199"/>
+      </w:pPr>
+      <w:r>
+        <w:t>client.ts is no longer reachable — the barrel skips it. node.ts is server-only despite being the entry-point for the CLI script (which runs in plain Node and doesn't need that marker; in a non-Next process server-only is a no-op so it works, but the intent is muddled). Pick one of:</w:t>
+      </w:r>
+    </w:p>
+    <w:p>
+      <w:pPr>
+        <w:numPr>
+          <w:ilvl w:val="0"/>
+          <w:numId w:val="28"/>
+        </w:numPr>
+        <w:ind w:right="1199"/>
+      </w:pPr>
+      <w:r>
+        <w:t>Keep client-node.ts as pure; have one index.ts that is server-only and re-exports everything. Delete client.ts and node.ts. Have the CLI import from client-node.ts directly.</w:t>
+      </w:r>
+    </w:p>
+    <w:p>
+      <w:pPr>
+        <w:numPr>
+          <w:ilvl w:val="0"/>
+          <w:numId w:val="28"/>
+        </w:numPr>
+        <w:ind w:right="1199"/>
+      </w:pPr>
+      <w:r>
+        <w:t>Or keep the node.ts barrel for CLI use and drop the server-only from it (the import is meaningful only in a bundler context).</w:t>
+      </w:r>
+    </w:p>
+    <w:p>
+      <w:pPr>
+        <w:ind w:right="1199"/>
+      </w:pPr>
+      <w:r>
+        <w:t>Either is fine. Both client.ts AND node.ts is one layer of indirection that already produces "which file does this come from?" confusion in a 4-file directory.</w:t>
+      </w:r>
+    </w:p>
+    <w:p>
+      <w:pPr>
+        <w:ind w:right="1199"/>
+      </w:pPr>
+      <w:r>
+        <w:t>9. The lib/runtime/config.ts extraction is half-done.</w:t>
+      </w:r>
+    </w:p>
+    <w:p>
+      <w:pPr>
+        <w:ind w:right="1199"/>
+      </w:pPr>
+      <w:hyperlink r:id="rId42" w:tgtFrame="_blank" w:history="1">
+        <w:r>
+          <w:rPr>
+            <w:rStyle w:val="Hyperlink"/>
+          </w:rPr>
+          <w:t>runtime/config.ts:11-15</w:t>
+        </w:r>
+      </w:hyperlink>
+      <w:r>
+        <w:t> still calls requiredEnv("OPENAI_API_KEY") / requiredEnv("ANTHROPIC_API_KEY") at module load. The point of the split (presumably) was so the CLI and tests can import config without the server-only mark. But the eager env requirement still fires for anyone who imports runtime/config. Tests that touch any provider transitively still need both keys in env. The split only solved the bundling boundary; it didn't fix the env-coupling boundary.</w:t>
+      </w:r>
+    </w:p>
+    <w:p>
+      <w:pPr>
+        <w:ind w:right="1199"/>
+      </w:pPr>
+      <w:r>
+        <w:t>If the goal was to make providers testable without env, add config.test.ts-style overrides or move the requiredEnv calls into lazy getters. If the goal was only to satisfy the server-only boundary, the split is fine but is missing a comment explaining what runtime/ is for.</w:t>
+      </w:r>
+    </w:p>
+    <w:p>
+      <w:pPr>
+        <w:ind w:right="1199"/>
+      </w:pPr>
+      <w:r>
+        <w:t>10. The duplicate-message persistence bug is still live.</w:t>
+      </w:r>
+    </w:p>
+    <w:p>
+      <w:pPr>
+        <w:ind w:right="1199"/>
+      </w:pPr>
+      <w:r>
+        <w:t>Audit-flagged in the previous round and still unfixed in </w:t>
+      </w:r>
+      <w:hyperlink r:id="rId43" w:tgtFrame="_blank" w:history="1">
+        <w:r>
+          <w:rPr>
+            <w:rStyle w:val="Hyperlink"/>
+          </w:rPr>
+          <w:t>route.ts:28</w:t>
+        </w:r>
+      </w:hyperlink>
+      <w:r>
+        <w:t>:</w:t>
+      </w:r>
+    </w:p>
+    <w:p>
+      <w:pPr>
+        <w:ind w:right="1199"/>
+      </w:pPr>
+      <w:r>
+        <w:t>id: message.id ?? globalThis.crypto.randomUUID(),</w:t>
+      </w:r>
+    </w:p>
+    <w:p>
+      <w:pPr>
+        <w:ind w:right="1199"/>
+      </w:pPr>
+      <w:r>
+        <w:t>Client's </w:t>
+      </w:r>
+      <w:hyperlink r:id="rId44" w:tgtFrame="_blank" w:history="1">
+        <w:r>
+          <w:rPr>
+            <w:rStyle w:val="Hyperlink"/>
+          </w:rPr>
+          <w:t>toApiMessage</w:t>
+        </w:r>
+      </w:hyperlink>
+      <w:r>
+        <w:t> still strips ids, so this fallback fires for every message every turn. INSERT OR IGNORE can't dedupe — every random UUID is fresh. After N turns, the first user message exists N times in messages. When Phase 2 tools land and the router starts reading history for context, this O(N²) inflation will distort context budgeting.</w:t>
+      </w:r>
+    </w:p>
+    <w:p>
+      <w:pPr>
+        <w:ind w:right="1199"/>
+      </w:pPr>
+      <w:r>
+        <w:t>Two-line fix: have toApiMessage pass id through. (Same fix as the previous audit identified.)</w:t>
+      </w:r>
+    </w:p>
+    <w:p>
+      <w:pPr>
+        <w:ind w:right="1199"/>
+      </w:pPr>
+      <w:r>
+        <w:pict w14:anchorId="234A246A">
+          <v:rect id="_x0000_i1051" style="width:0;height:0" o:hralign="center" o:hrstd="t" o:hr="t" fillcolor="#a0a0a0" stroked="f"/>
+        </w:pict>
+      </w:r>
+    </w:p>
+    <w:p>
+      <w:pPr>
+        <w:ind w:right="1199"/>
+      </w:pPr>
+      <w:r>
+        <w:t>P2 — Polish / nice-to-have</w:t>
+      </w:r>
+    </w:p>
+    <w:p>
+      <w:pPr>
+        <w:numPr>
+          <w:ilvl w:val="0"/>
+          <w:numId w:val="29"/>
+        </w:numPr>
+        <w:ind w:right="1199"/>
+      </w:pPr>
+      <w:r>
+        <w:t>No _schema_migrations table. Today everything is CREATE TABLE IF NOT EXISTS. First ALTER TABLE migration will be awkward.</w:t>
+      </w:r>
+    </w:p>
+    <w:p>
+      <w:pPr>
+        <w:numPr>
+          <w:ilvl w:val="0"/>
+          <w:numId w:val="29"/>
+        </w:numPr>
+        <w:ind w:right="1199"/>
+      </w:pPr>
+      <w:r>
+        <w:t>No SSE heartbeat, no X-Accel-Buffering: no header. Fine locally; matters the moment anything proxies the SSE.</w:t>
+      </w:r>
+    </w:p>
+    <w:p>
+      <w:pPr>
+        <w:numPr>
+          <w:ilvl w:val="0"/>
+          <w:numId w:val="29"/>
+        </w:numPr>
+        <w:ind w:right="1199"/>
+      </w:pPr>
+      <w:r>
+        <w:t>Anthropic pricing still falls back to placeholder. Silent — by design — but cost guard underestimates Anthropic burn.</w:t>
+      </w:r>
+    </w:p>
+    <w:p>
+      <w:pPr>
+        <w:numPr>
+          <w:ilvl w:val="0"/>
+          <w:numId w:val="29"/>
+        </w:numPr>
+        <w:ind w:right="1199"/>
+      </w:pPr>
+      <w:r>
+        <w:lastRenderedPageBreak/>
+        <w:t>HMR leak on cached in </w:t>
+      </w:r>
+      <w:hyperlink r:id="rId45" w:tgtFrame="_blank" w:history="1">
+        <w:r>
+          <w:rPr>
+            <w:rStyle w:val="Hyperlink"/>
+          </w:rPr>
+          <w:t>client-node.ts:6</w:t>
+        </w:r>
+      </w:hyperlink>
+      <w:r>
+        <w:t>. Dev-only file-handle leak across hot reloads. Fix: stash on globalThis.</w:t>
+      </w:r>
+    </w:p>
+    <w:p>
+      <w:pPr>
+        <w:numPr>
+          <w:ilvl w:val="0"/>
+          <w:numId w:val="29"/>
+        </w:numPr>
+        <w:ind w:right="1199"/>
+      </w:pPr>
+      <w:r>
+        <w:t>Intent regex misses common cases. "What's the weather" matches both INFORMATION_REQUEST regex (^what) and would benefit from being explicit, but works. The REASONING_TASK regex catches "why" — but "why is the sky blue" is closer to INFORMATION_REQUEST. Refinement, not breakage.</w:t>
+      </w:r>
+    </w:p>
+    <w:p>
+      <w:pPr>
+        <w:numPr>
+          <w:ilvl w:val="0"/>
+          <w:numId w:val="29"/>
+        </w:numPr>
+        <w:ind w:right="1199"/>
+      </w:pPr>
+      <w:r>
+        <w:t>Tool capability is hardcoded to ["text", "stream"] for chat-shaped intents in </w:t>
+      </w:r>
+      <w:hyperlink r:id="rId46" w:tgtFrame="_blank" w:history="1">
+        <w:r>
+          <w:rPr>
+            <w:rStyle w:val="Hyperlink"/>
+          </w:rPr>
+          <w:t>capability.ts:25</w:t>
+        </w:r>
+      </w:hyperlink>
+      <w:r>
+        <w:t>. When local Ollama lands and you actually want tier T1 routing for paraphrases, this needs revisiting. Not before Phase 2.</w:t>
+      </w:r>
+    </w:p>
+    <w:p>
+      <w:pPr>
+        <w:ind w:right="1199"/>
+      </w:pPr>
+      <w:r>
+        <w:pict w14:anchorId="6E63C003">
+          <v:rect id="_x0000_i1052" style="width:0;height:0" o:hralign="center" o:hrstd="t" o:hr="t" fillcolor="#a0a0a0" stroked="f"/>
+        </w:pict>
+      </w:r>
+    </w:p>
+    <w:p>
+      <w:pPr>
+        <w:ind w:right="1199"/>
+      </w:pPr>
+      <w:r>
+        <w:t>Architectural coherence — overall assessment</w:t>
+      </w:r>
+    </w:p>
+    <w:p>
+      <w:pPr>
+        <w:ind w:right="1199"/>
+      </w:pPr>
+      <w:r>
+        <w:t>What's healthy:</w:t>
+      </w:r>
+    </w:p>
+    <w:p>
+      <w:pPr>
+        <w:numPr>
+          <w:ilvl w:val="0"/>
+          <w:numId w:val="30"/>
+        </w:numPr>
+        <w:ind w:right="1199"/>
+      </w:pPr>
+      <w:r>
+        <w:t>Provider abstraction is doing its job. OpenAI + Anthropic implement the same ChatProvider interface; the eval runner consumes that interface; the route doesn't know which provider it's calling. Adding Ollama will be a single file.</w:t>
+      </w:r>
+    </w:p>
+    <w:p>
+      <w:pPr>
+        <w:numPr>
+          <w:ilvl w:val="0"/>
+          <w:numId w:val="30"/>
+        </w:numPr>
+        <w:ind w:right="1199"/>
+      </w:pPr>
+      <w:r>
+        <w:t>The router is structurally correct (intent → safety → capability → selection are four independently testable stages, with RouterDecision carrying all four through to telemetry). The four-stage shape itself is the right v3.1 spec.</w:t>
+      </w:r>
+    </w:p>
+    <w:p>
+      <w:pPr>
+        <w:numPr>
+          <w:ilvl w:val="0"/>
+          <w:numId w:val="30"/>
+        </w:numPr>
+        <w:ind w:right="1199"/>
+      </w:pPr>
+      <w:r>
+        <w:t>Telemetry is </w:t>
+      </w:r>
+      <w:r>
+        <w:rPr>
+          <w:i/>
+          <w:iCs/>
+        </w:rPr>
+        <w:t>populated</w:t>
+      </w:r>
+      <w:r>
+        <w:t>. Intent, safety_tag, tier, latency, TTFT, cost, model_id all flow through to SQLite per call. The router decision is captured in the right places. This is what the v3.1 doc asked for and it actually exists.</w:t>
+      </w:r>
+    </w:p>
+    <w:p>
+      <w:pPr>
+        <w:numPr>
+          <w:ilvl w:val="0"/>
+          <w:numId w:val="30"/>
+        </w:numPr>
+        <w:ind w:right="1199"/>
+      </w:pPr>
+      <w:r>
+        <w:t>Eval framework is decoupled from the route — exactly right. Storing results in their own tables (not telemetry) is the correct call; calibration cost shouldn't pollute production cost roll-ups.</w:t>
+      </w:r>
+    </w:p>
+    <w:p>
+      <w:pPr>
+        <w:numPr>
+          <w:ilvl w:val="0"/>
+          <w:numId w:val="30"/>
+        </w:numPr>
+        <w:ind w:right="1199"/>
+      </w:pPr>
+      <w:r>
+        <w:t>SSE module extraction (encoder + parser) is small and clean. Tested.</w:t>
+      </w:r>
+    </w:p>
+    <w:p>
+      <w:pPr>
+        <w:numPr>
+          <w:ilvl w:val="0"/>
+          <w:numId w:val="30"/>
+        </w:numPr>
+        <w:ind w:right="1199"/>
+      </w:pPr>
+      <w:r>
+        <w:t>Tool registry is the smallest possible scaffold. Right shape.</w:t>
+      </w:r>
+    </w:p>
+    <w:p>
+      <w:pPr>
+        <w:ind w:right="1199"/>
+      </w:pPr>
+      <w:r>
+        <w:t>What's incoherent:</w:t>
+      </w:r>
+    </w:p>
+    <w:p>
+      <w:pPr>
+        <w:numPr>
+          <w:ilvl w:val="0"/>
+          <w:numId w:val="31"/>
+        </w:numPr>
+        <w:ind w:right="1199"/>
+      </w:pPr>
+      <w:r>
+        <w:t>Safety enforcement (P0 </w:t>
+      </w:r>
+      <w:hyperlink r:id="rId47" w:tgtFrame="_blank" w:history="1">
+        <w:r>
+          <w:rPr>
+            <w:rStyle w:val="Hyperlink"/>
+          </w:rPr>
+          <w:t>#1</w:t>
+        </w:r>
+      </w:hyperlink>
+      <w:r>
+        <w:t>) is operating on the wrong semantic axis. The principle is right; the placement is wrong.</w:t>
+      </w:r>
+    </w:p>
+    <w:p>
+      <w:pPr>
+        <w:numPr>
+          <w:ilvl w:val="0"/>
+          <w:numId w:val="31"/>
+        </w:numPr>
+        <w:ind w:right="1199"/>
+      </w:pPr>
+      <w:r>
+        <w:t>The DB-layer file proliferation (P1 </w:t>
+      </w:r>
+      <w:hyperlink r:id="rId48" w:tgtFrame="_blank" w:history="1">
+        <w:r>
+          <w:rPr>
+            <w:rStyle w:val="Hyperlink"/>
+          </w:rPr>
+          <w:t>#8</w:t>
+        </w:r>
+      </w:hyperlink>
+      <w:r>
+        <w:t>) shows a refactor mid-flight; pick the final shape before anything else imports the DB.</w:t>
+      </w:r>
+    </w:p>
+    <w:p>
+      <w:pPr>
+        <w:numPr>
+          <w:ilvl w:val="0"/>
+          <w:numId w:val="31"/>
+        </w:numPr>
+        <w:ind w:right="1199"/>
+      </w:pPr>
+      <w:r>
+        <w:t>The runtime/config split (P1 </w:t>
+      </w:r>
+      <w:hyperlink r:id="rId49" w:tgtFrame="_blank" w:history="1">
+        <w:r>
+          <w:rPr>
+            <w:rStyle w:val="Hyperlink"/>
+          </w:rPr>
+          <w:t>#9</w:t>
+        </w:r>
+      </w:hyperlink>
+      <w:r>
+        <w:t>) doesn't deliver what its name implies.</w:t>
+      </w:r>
+    </w:p>
+    <w:p>
+      <w:pPr>
+        <w:ind w:right="1199"/>
+      </w:pPr>
+      <w:r>
+        <w:t>What's dangerous before Phase 2:</w:t>
+      </w:r>
+    </w:p>
+    <w:p>
+      <w:pPr>
+        <w:numPr>
+          <w:ilvl w:val="0"/>
+          <w:numId w:val="32"/>
+        </w:numPr>
+        <w:ind w:right="1199"/>
+      </w:pPr>
+      <w:r>
+        <w:t>The four together (no tool runner enforcement, no abort signal, no tool_calls table, no runtime decision) mean the first filesystem tool written tomorrow ships with: no permission gate, no timeout, no audit trail, and unclear isolation. Land the tool runner + ToolContext.signal + tool_calls table + runtime decision (</w:t>
+      </w:r>
+      <w:hyperlink r:id="rId50" w:tgtFrame="_blank" w:history="1">
+        <w:r>
+          <w:rPr>
+            <w:rStyle w:val="Hyperlink"/>
+          </w:rPr>
+          <w:t>#2</w:t>
+        </w:r>
+      </w:hyperlink>
+      <w:r>
+        <w:t>, </w:t>
+      </w:r>
+      <w:hyperlink r:id="rId51" w:tgtFrame="_blank" w:history="1">
+        <w:r>
+          <w:rPr>
+            <w:rStyle w:val="Hyperlink"/>
+          </w:rPr>
+          <w:t>#3</w:t>
+        </w:r>
+      </w:hyperlink>
+      <w:r>
+        <w:t>, </w:t>
+      </w:r>
+      <w:hyperlink r:id="rId52" w:tgtFrame="_blank" w:history="1">
+        <w:r>
+          <w:rPr>
+            <w:rStyle w:val="Hyperlink"/>
+          </w:rPr>
+          <w:t>#4</w:t>
+        </w:r>
+      </w:hyperlink>
+      <w:r>
+        <w:t>, </w:t>
+      </w:r>
+      <w:hyperlink r:id="rId53" w:tgtFrame="_blank" w:history="1">
+        <w:r>
+          <w:rPr>
+            <w:rStyle w:val="Hyperlink"/>
+          </w:rPr>
+          <w:t>#5</w:t>
+        </w:r>
+      </w:hyperlink>
+      <w:r>
+        <w:t>) before any tool with side effects exists.</w:t>
+      </w:r>
+    </w:p>
+    <w:p>
+      <w:pPr>
+        <w:ind w:right="1199"/>
+      </w:pPr>
+      <w:r>
+        <w:t>Provider abstraction quality</w:t>
+      </w:r>
+    </w:p>
+    <w:p>
+      <w:pPr>
+        <w:ind w:right="1199"/>
+      </w:pPr>
+      <w:r>
+        <w:lastRenderedPageBreak/>
+        <w:t>Solid. Both providers implement the full interface, including the streaming shape. AbortSignal threads. TTFT captured. Cost via the unified calculateCostUsd lookup. The only future-work item is the GenerateOptions.tools parameter and tool-call event emission (P0 </w:t>
+      </w:r>
+      <w:hyperlink r:id="rId54" w:tgtFrame="_blank" w:history="1">
+        <w:r>
+          <w:rPr>
+            <w:rStyle w:val="Hyperlink"/>
+          </w:rPr>
+          <w:t>#6</w:t>
+        </w:r>
+      </w:hyperlink>
+      <w:r>
+        <w:t>) — and that's a known gap, not a flaw.</w:t>
+      </w:r>
+    </w:p>
+    <w:p>
+      <w:pPr>
+        <w:ind w:right="1199"/>
+      </w:pPr>
+      <w:r>
+        <w:t>Telemetry completeness</w:t>
+      </w:r>
+    </w:p>
+    <w:p>
+      <w:pPr>
+        <w:ind w:right="1199"/>
+      </w:pPr>
+      <w:r>
+        <w:t>Better than expected. All seven router/route gates emit events with intent/safety_tag/tier/model_id/latency/cost populated. safety_blocked and confirmation_required got their own event types. time_to_first_token_ms is captured. The only missing pieces are session_id propagation into events (route generates sessionId for persistence but doesn't pass it into recordEvent) and the tool_calls audit trail (P0 </w:t>
+      </w:r>
+      <w:hyperlink r:id="rId55" w:tgtFrame="_blank" w:history="1">
+        <w:r>
+          <w:rPr>
+            <w:rStyle w:val="Hyperlink"/>
+          </w:rPr>
+          <w:t>#4</w:t>
+        </w:r>
+      </w:hyperlink>
+      <w:r>
+        <w:t>).</w:t>
+      </w:r>
+    </w:p>
+    <w:p>
+      <w:pPr>
+        <w:ind w:right="1199"/>
+      </w:pPr>
+      <w:r>
+        <w:t>TL;DR — what MUST be fixed before Phase 2</w:t>
+      </w:r>
+    </w:p>
+    <w:p>
+      <w:pPr>
+        <w:numPr>
+          <w:ilvl w:val="0"/>
+          <w:numId w:val="33"/>
+        </w:numPr>
+        <w:ind w:right="1199"/>
+      </w:pPr>
+      <w:r>
+        <w:t>(blocks today) Make safety enforcement only block on BLOCK; let CONFIRM_* flow through to model context until a tool runner exists to honor it.</w:t>
+      </w:r>
+    </w:p>
+    <w:p>
+      <w:pPr>
+        <w:numPr>
+          <w:ilvl w:val="0"/>
+          <w:numId w:val="33"/>
+        </w:numPr>
+        <w:ind w:right="1199"/>
+      </w:pPr>
+      <w:r>
+        <w:t>(blocks Phase 2) Tool runner that compares Tool.requiredSafetyTag against router decision and refuses to call execute() on mismatch.</w:t>
+      </w:r>
+    </w:p>
+    <w:p>
+      <w:pPr>
+        <w:numPr>
+          <w:ilvl w:val="0"/>
+          <w:numId w:val="33"/>
+        </w:numPr>
+        <w:ind w:right="1199"/>
+      </w:pPr>
+      <w:r>
+        <w:t>(blocks Phase 2) Add AbortSignal + timeoutMs to ToolContext.</w:t>
+      </w:r>
+    </w:p>
+    <w:p>
+      <w:pPr>
+        <w:numPr>
+          <w:ilvl w:val="0"/>
+          <w:numId w:val="33"/>
+        </w:numPr>
+        <w:ind w:right="1199"/>
+      </w:pPr>
+      <w:r>
+        <w:t>(blocks Phase 2) tool_calls SQLite table + persistence path inside the runner.</w:t>
+      </w:r>
+    </w:p>
+    <w:p>
+      <w:pPr>
+        <w:numPr>
+          <w:ilvl w:val="0"/>
+          <w:numId w:val="33"/>
+        </w:numPr>
+        <w:ind w:right="1199"/>
+      </w:pPr>
+      <w:r>
+        <w:t>(blocks Phase 2) Pick the tool-execution runtime (Next route / sidecar / Electron) and document it; add a boot-time guard that prevents non-loopback binding while tools live in the Next process.</w:t>
+      </w:r>
+    </w:p>
+    <w:p>
+      <w:pPr>
+        <w:numPr>
+          <w:ilvl w:val="0"/>
+          <w:numId w:val="33"/>
+        </w:numPr>
+        <w:ind w:right="1199"/>
+      </w:pPr>
+      <w:r>
+        <w:t>(blocks Phase 2) GenerateOptions.tools; OpenAI + Anthropic providers emit tool_call_* events; route stream-loop branch that hands off to the tool runner and resumes the model with results.</w:t>
+      </w:r>
+    </w:p>
+    <w:p>
+      <w:pPr>
+        <w:ind w:right="1199"/>
+      </w:pPr>
+      <w:r>
+        <w:t>Everything in P1 is real debt but won't directly break Phase 2 — it'll just make the eventual cleanup more expensive. P2 items are stewardship; do them during the next quiet pass.</w:t>
+      </w:r>
+    </w:p>
+    <w:p>
+      <w:pPr>
+        <w:ind w:right="1199"/>
+      </w:pPr>
+      <w:r>
+        <w:t>Do not start filesystem / app-launch / terminal tools until all six P0 items above are in. The current ChatProvider + router shape is correct; adding tool execution to it without these six is the moment the system gains the ability to do something the user can't unwind.</w:t>
+      </w:r>
+    </w:p>
+    <w:p>
+      <w:pPr>
+        <w:ind w:right="1199"/>
       </w:pPr>
     </w:p>
     <w:p>
@@ -8949,9 +10932,9 @@
       </w:pPr>
     </w:p>
     <w:sectPr>
-      <w:footerReference w:type="even" r:id="rId23"/>
-      <w:footerReference w:type="default" r:id="rId24"/>
-      <w:footerReference w:type="first" r:id="rId25"/>
+      <w:footerReference w:type="even" r:id="rId56"/>
+      <w:footerReference w:type="default" r:id="rId57"/>
+      <w:footerReference w:type="first" r:id="rId58"/>
       <w:pgSz w:w="12240" w:h="15840"/>
       <w:pgMar w:top="1200" w:right="0" w:bottom="1600" w:left="1200" w:header="720" w:footer="687" w:gutter="0"/>
       <w:cols w:space="720"/>
@@ -9530,6 +11513,155 @@
     </w:lvl>
   </w:abstractNum>
   <w:abstractNum w:abstractNumId="2" w15:restartNumberingAfterBreak="0">
+    <w:nsid w:val="0FAC7218"/>
+    <w:multiLevelType w:val="multilevel"/>
+    <w:tmpl w:val="8A0433FC"/>
+    <w:lvl w:ilvl="0">
+      <w:start w:val="1"/>
+      <w:numFmt w:val="bullet"/>
+      <w:lvlText w:val=""/>
+      <w:lvlJc w:val="left"/>
+      <w:pPr>
+        <w:tabs>
+          <w:tab w:val="num" w:pos="720"/>
+        </w:tabs>
+        <w:ind w:left="720" w:hanging="360"/>
+      </w:pPr>
+      <w:rPr>
+        <w:rFonts w:ascii="Symbol" w:hAnsi="Symbol" w:hint="default"/>
+        <w:sz w:val="20"/>
+      </w:rPr>
+    </w:lvl>
+    <w:lvl w:ilvl="1" w:tentative="1">
+      <w:start w:val="1"/>
+      <w:numFmt w:val="bullet"/>
+      <w:lvlText w:val=""/>
+      <w:lvlJc w:val="left"/>
+      <w:pPr>
+        <w:tabs>
+          <w:tab w:val="num" w:pos="1440"/>
+        </w:tabs>
+        <w:ind w:left="1440" w:hanging="360"/>
+      </w:pPr>
+      <w:rPr>
+        <w:rFonts w:ascii="Symbol" w:hAnsi="Symbol" w:hint="default"/>
+        <w:sz w:val="20"/>
+      </w:rPr>
+    </w:lvl>
+    <w:lvl w:ilvl="2" w:tentative="1">
+      <w:start w:val="1"/>
+      <w:numFmt w:val="bullet"/>
+      <w:lvlText w:val=""/>
+      <w:lvlJc w:val="left"/>
+      <w:pPr>
+        <w:tabs>
+          <w:tab w:val="num" w:pos="2160"/>
+        </w:tabs>
+        <w:ind w:left="2160" w:hanging="360"/>
+      </w:pPr>
+      <w:rPr>
+        <w:rFonts w:ascii="Symbol" w:hAnsi="Symbol" w:hint="default"/>
+        <w:sz w:val="20"/>
+      </w:rPr>
+    </w:lvl>
+    <w:lvl w:ilvl="3" w:tentative="1">
+      <w:start w:val="1"/>
+      <w:numFmt w:val="bullet"/>
+      <w:lvlText w:val=""/>
+      <w:lvlJc w:val="left"/>
+      <w:pPr>
+        <w:tabs>
+          <w:tab w:val="num" w:pos="2880"/>
+        </w:tabs>
+        <w:ind w:left="2880" w:hanging="360"/>
+      </w:pPr>
+      <w:rPr>
+        <w:rFonts w:ascii="Symbol" w:hAnsi="Symbol" w:hint="default"/>
+        <w:sz w:val="20"/>
+      </w:rPr>
+    </w:lvl>
+    <w:lvl w:ilvl="4" w:tentative="1">
+      <w:start w:val="1"/>
+      <w:numFmt w:val="bullet"/>
+      <w:lvlText w:val=""/>
+      <w:lvlJc w:val="left"/>
+      <w:pPr>
+        <w:tabs>
+          <w:tab w:val="num" w:pos="3600"/>
+        </w:tabs>
+        <w:ind w:left="3600" w:hanging="360"/>
+      </w:pPr>
+      <w:rPr>
+        <w:rFonts w:ascii="Symbol" w:hAnsi="Symbol" w:hint="default"/>
+        <w:sz w:val="20"/>
+      </w:rPr>
+    </w:lvl>
+    <w:lvl w:ilvl="5" w:tentative="1">
+      <w:start w:val="1"/>
+      <w:numFmt w:val="bullet"/>
+      <w:lvlText w:val=""/>
+      <w:lvlJc w:val="left"/>
+      <w:pPr>
+        <w:tabs>
+          <w:tab w:val="num" w:pos="4320"/>
+        </w:tabs>
+        <w:ind w:left="4320" w:hanging="360"/>
+      </w:pPr>
+      <w:rPr>
+        <w:rFonts w:ascii="Symbol" w:hAnsi="Symbol" w:hint="default"/>
+        <w:sz w:val="20"/>
+      </w:rPr>
+    </w:lvl>
+    <w:lvl w:ilvl="6" w:tentative="1">
+      <w:start w:val="1"/>
+      <w:numFmt w:val="bullet"/>
+      <w:lvlText w:val=""/>
+      <w:lvlJc w:val="left"/>
+      <w:pPr>
+        <w:tabs>
+          <w:tab w:val="num" w:pos="5040"/>
+        </w:tabs>
+        <w:ind w:left="5040" w:hanging="360"/>
+      </w:pPr>
+      <w:rPr>
+        <w:rFonts w:ascii="Symbol" w:hAnsi="Symbol" w:hint="default"/>
+        <w:sz w:val="20"/>
+      </w:rPr>
+    </w:lvl>
+    <w:lvl w:ilvl="7" w:tentative="1">
+      <w:start w:val="1"/>
+      <w:numFmt w:val="bullet"/>
+      <w:lvlText w:val=""/>
+      <w:lvlJc w:val="left"/>
+      <w:pPr>
+        <w:tabs>
+          <w:tab w:val="num" w:pos="5760"/>
+        </w:tabs>
+        <w:ind w:left="5760" w:hanging="360"/>
+      </w:pPr>
+      <w:rPr>
+        <w:rFonts w:ascii="Symbol" w:hAnsi="Symbol" w:hint="default"/>
+        <w:sz w:val="20"/>
+      </w:rPr>
+    </w:lvl>
+    <w:lvl w:ilvl="8" w:tentative="1">
+      <w:start w:val="1"/>
+      <w:numFmt w:val="bullet"/>
+      <w:lvlText w:val=""/>
+      <w:lvlJc w:val="left"/>
+      <w:pPr>
+        <w:tabs>
+          <w:tab w:val="num" w:pos="6480"/>
+        </w:tabs>
+        <w:ind w:left="6480" w:hanging="360"/>
+      </w:pPr>
+      <w:rPr>
+        <w:rFonts w:ascii="Symbol" w:hAnsi="Symbol" w:hint="default"/>
+        <w:sz w:val="20"/>
+      </w:rPr>
+    </w:lvl>
+  </w:abstractNum>
+  <w:abstractNum w:abstractNumId="3" w15:restartNumberingAfterBreak="0">
     <w:nsid w:val="1A0C04E0"/>
     <w:multiLevelType w:val="hybridMultilevel"/>
     <w:tmpl w:val="E2126BF6"/>
@@ -9741,7 +11873,7 @@
       </w:rPr>
     </w:lvl>
   </w:abstractNum>
-  <w:abstractNum w:abstractNumId="3" w15:restartNumberingAfterBreak="0">
+  <w:abstractNum w:abstractNumId="4" w15:restartNumberingAfterBreak="0">
     <w:nsid w:val="22152653"/>
     <w:multiLevelType w:val="multilevel"/>
     <w:tmpl w:val="FE1E885A"/>
@@ -9854,7 +11986,7 @@
       </w:pPr>
     </w:lvl>
   </w:abstractNum>
-  <w:abstractNum w:abstractNumId="4" w15:restartNumberingAfterBreak="0">
+  <w:abstractNum w:abstractNumId="5" w15:restartNumberingAfterBreak="0">
     <w:nsid w:val="24417F44"/>
     <w:multiLevelType w:val="multilevel"/>
     <w:tmpl w:val="69623CB0"/>
@@ -10003,7 +12135,7 @@
       </w:rPr>
     </w:lvl>
   </w:abstractNum>
-  <w:abstractNum w:abstractNumId="5" w15:restartNumberingAfterBreak="0">
+  <w:abstractNum w:abstractNumId="6" w15:restartNumberingAfterBreak="0">
     <w:nsid w:val="25990F55"/>
     <w:multiLevelType w:val="multilevel"/>
     <w:tmpl w:val="DB0290A8"/>
@@ -10116,7 +12248,7 @@
       </w:pPr>
     </w:lvl>
   </w:abstractNum>
-  <w:abstractNum w:abstractNumId="6" w15:restartNumberingAfterBreak="0">
+  <w:abstractNum w:abstractNumId="7" w15:restartNumberingAfterBreak="0">
     <w:nsid w:val="25AA21EA"/>
     <w:multiLevelType w:val="hybridMultilevel"/>
     <w:tmpl w:val="71765196"/>
@@ -10328,7 +12460,156 @@
       </w:rPr>
     </w:lvl>
   </w:abstractNum>
-  <w:abstractNum w:abstractNumId="7" w15:restartNumberingAfterBreak="0">
+  <w:abstractNum w:abstractNumId="8" w15:restartNumberingAfterBreak="0">
+    <w:nsid w:val="295F4F43"/>
+    <w:multiLevelType w:val="multilevel"/>
+    <w:tmpl w:val="E84E7D02"/>
+    <w:lvl w:ilvl="0">
+      <w:start w:val="1"/>
+      <w:numFmt w:val="bullet"/>
+      <w:lvlText w:val=""/>
+      <w:lvlJc w:val="left"/>
+      <w:pPr>
+        <w:tabs>
+          <w:tab w:val="num" w:pos="720"/>
+        </w:tabs>
+        <w:ind w:left="720" w:hanging="360"/>
+      </w:pPr>
+      <w:rPr>
+        <w:rFonts w:ascii="Symbol" w:hAnsi="Symbol" w:hint="default"/>
+        <w:sz w:val="20"/>
+      </w:rPr>
+    </w:lvl>
+    <w:lvl w:ilvl="1" w:tentative="1">
+      <w:start w:val="1"/>
+      <w:numFmt w:val="bullet"/>
+      <w:lvlText w:val=""/>
+      <w:lvlJc w:val="left"/>
+      <w:pPr>
+        <w:tabs>
+          <w:tab w:val="num" w:pos="1440"/>
+        </w:tabs>
+        <w:ind w:left="1440" w:hanging="360"/>
+      </w:pPr>
+      <w:rPr>
+        <w:rFonts w:ascii="Symbol" w:hAnsi="Symbol" w:hint="default"/>
+        <w:sz w:val="20"/>
+      </w:rPr>
+    </w:lvl>
+    <w:lvl w:ilvl="2" w:tentative="1">
+      <w:start w:val="1"/>
+      <w:numFmt w:val="bullet"/>
+      <w:lvlText w:val=""/>
+      <w:lvlJc w:val="left"/>
+      <w:pPr>
+        <w:tabs>
+          <w:tab w:val="num" w:pos="2160"/>
+        </w:tabs>
+        <w:ind w:left="2160" w:hanging="360"/>
+      </w:pPr>
+      <w:rPr>
+        <w:rFonts w:ascii="Symbol" w:hAnsi="Symbol" w:hint="default"/>
+        <w:sz w:val="20"/>
+      </w:rPr>
+    </w:lvl>
+    <w:lvl w:ilvl="3" w:tentative="1">
+      <w:start w:val="1"/>
+      <w:numFmt w:val="bullet"/>
+      <w:lvlText w:val=""/>
+      <w:lvlJc w:val="left"/>
+      <w:pPr>
+        <w:tabs>
+          <w:tab w:val="num" w:pos="2880"/>
+        </w:tabs>
+        <w:ind w:left="2880" w:hanging="360"/>
+      </w:pPr>
+      <w:rPr>
+        <w:rFonts w:ascii="Symbol" w:hAnsi="Symbol" w:hint="default"/>
+        <w:sz w:val="20"/>
+      </w:rPr>
+    </w:lvl>
+    <w:lvl w:ilvl="4" w:tentative="1">
+      <w:start w:val="1"/>
+      <w:numFmt w:val="bullet"/>
+      <w:lvlText w:val=""/>
+      <w:lvlJc w:val="left"/>
+      <w:pPr>
+        <w:tabs>
+          <w:tab w:val="num" w:pos="3600"/>
+        </w:tabs>
+        <w:ind w:left="3600" w:hanging="360"/>
+      </w:pPr>
+      <w:rPr>
+        <w:rFonts w:ascii="Symbol" w:hAnsi="Symbol" w:hint="default"/>
+        <w:sz w:val="20"/>
+      </w:rPr>
+    </w:lvl>
+    <w:lvl w:ilvl="5" w:tentative="1">
+      <w:start w:val="1"/>
+      <w:numFmt w:val="bullet"/>
+      <w:lvlText w:val=""/>
+      <w:lvlJc w:val="left"/>
+      <w:pPr>
+        <w:tabs>
+          <w:tab w:val="num" w:pos="4320"/>
+        </w:tabs>
+        <w:ind w:left="4320" w:hanging="360"/>
+      </w:pPr>
+      <w:rPr>
+        <w:rFonts w:ascii="Symbol" w:hAnsi="Symbol" w:hint="default"/>
+        <w:sz w:val="20"/>
+      </w:rPr>
+    </w:lvl>
+    <w:lvl w:ilvl="6" w:tentative="1">
+      <w:start w:val="1"/>
+      <w:numFmt w:val="bullet"/>
+      <w:lvlText w:val=""/>
+      <w:lvlJc w:val="left"/>
+      <w:pPr>
+        <w:tabs>
+          <w:tab w:val="num" w:pos="5040"/>
+        </w:tabs>
+        <w:ind w:left="5040" w:hanging="360"/>
+      </w:pPr>
+      <w:rPr>
+        <w:rFonts w:ascii="Symbol" w:hAnsi="Symbol" w:hint="default"/>
+        <w:sz w:val="20"/>
+      </w:rPr>
+    </w:lvl>
+    <w:lvl w:ilvl="7" w:tentative="1">
+      <w:start w:val="1"/>
+      <w:numFmt w:val="bullet"/>
+      <w:lvlText w:val=""/>
+      <w:lvlJc w:val="left"/>
+      <w:pPr>
+        <w:tabs>
+          <w:tab w:val="num" w:pos="5760"/>
+        </w:tabs>
+        <w:ind w:left="5760" w:hanging="360"/>
+      </w:pPr>
+      <w:rPr>
+        <w:rFonts w:ascii="Symbol" w:hAnsi="Symbol" w:hint="default"/>
+        <w:sz w:val="20"/>
+      </w:rPr>
+    </w:lvl>
+    <w:lvl w:ilvl="8" w:tentative="1">
+      <w:start w:val="1"/>
+      <w:numFmt w:val="bullet"/>
+      <w:lvlText w:val=""/>
+      <w:lvlJc w:val="left"/>
+      <w:pPr>
+        <w:tabs>
+          <w:tab w:val="num" w:pos="6480"/>
+        </w:tabs>
+        <w:ind w:left="6480" w:hanging="360"/>
+      </w:pPr>
+      <w:rPr>
+        <w:rFonts w:ascii="Symbol" w:hAnsi="Symbol" w:hint="default"/>
+        <w:sz w:val="20"/>
+      </w:rPr>
+    </w:lvl>
+  </w:abstractNum>
+  <w:abstractNum w:abstractNumId="9" w15:restartNumberingAfterBreak="0">
     <w:nsid w:val="2D332CE6"/>
     <w:multiLevelType w:val="hybridMultilevel"/>
     <w:tmpl w:val="7604DC8A"/>
@@ -10540,7 +12821,7 @@
       </w:rPr>
     </w:lvl>
   </w:abstractNum>
-  <w:abstractNum w:abstractNumId="8" w15:restartNumberingAfterBreak="0">
+  <w:abstractNum w:abstractNumId="10" w15:restartNumberingAfterBreak="0">
     <w:nsid w:val="307B08A9"/>
     <w:multiLevelType w:val="multilevel"/>
     <w:tmpl w:val="B6963C3A"/>
@@ -10689,7 +12970,156 @@
       </w:rPr>
     </w:lvl>
   </w:abstractNum>
-  <w:abstractNum w:abstractNumId="9" w15:restartNumberingAfterBreak="0">
+  <w:abstractNum w:abstractNumId="11" w15:restartNumberingAfterBreak="0">
+    <w:nsid w:val="338125D5"/>
+    <w:multiLevelType w:val="multilevel"/>
+    <w:tmpl w:val="473E80EE"/>
+    <w:lvl w:ilvl="0">
+      <w:start w:val="1"/>
+      <w:numFmt w:val="bullet"/>
+      <w:lvlText w:val=""/>
+      <w:lvlJc w:val="left"/>
+      <w:pPr>
+        <w:tabs>
+          <w:tab w:val="num" w:pos="720"/>
+        </w:tabs>
+        <w:ind w:left="720" w:hanging="360"/>
+      </w:pPr>
+      <w:rPr>
+        <w:rFonts w:ascii="Symbol" w:hAnsi="Symbol" w:hint="default"/>
+        <w:sz w:val="20"/>
+      </w:rPr>
+    </w:lvl>
+    <w:lvl w:ilvl="1" w:tentative="1">
+      <w:start w:val="1"/>
+      <w:numFmt w:val="bullet"/>
+      <w:lvlText w:val=""/>
+      <w:lvlJc w:val="left"/>
+      <w:pPr>
+        <w:tabs>
+          <w:tab w:val="num" w:pos="1440"/>
+        </w:tabs>
+        <w:ind w:left="1440" w:hanging="360"/>
+      </w:pPr>
+      <w:rPr>
+        <w:rFonts w:ascii="Symbol" w:hAnsi="Symbol" w:hint="default"/>
+        <w:sz w:val="20"/>
+      </w:rPr>
+    </w:lvl>
+    <w:lvl w:ilvl="2" w:tentative="1">
+      <w:start w:val="1"/>
+      <w:numFmt w:val="bullet"/>
+      <w:lvlText w:val=""/>
+      <w:lvlJc w:val="left"/>
+      <w:pPr>
+        <w:tabs>
+          <w:tab w:val="num" w:pos="2160"/>
+        </w:tabs>
+        <w:ind w:left="2160" w:hanging="360"/>
+      </w:pPr>
+      <w:rPr>
+        <w:rFonts w:ascii="Symbol" w:hAnsi="Symbol" w:hint="default"/>
+        <w:sz w:val="20"/>
+      </w:rPr>
+    </w:lvl>
+    <w:lvl w:ilvl="3" w:tentative="1">
+      <w:start w:val="1"/>
+      <w:numFmt w:val="bullet"/>
+      <w:lvlText w:val=""/>
+      <w:lvlJc w:val="left"/>
+      <w:pPr>
+        <w:tabs>
+          <w:tab w:val="num" w:pos="2880"/>
+        </w:tabs>
+        <w:ind w:left="2880" w:hanging="360"/>
+      </w:pPr>
+      <w:rPr>
+        <w:rFonts w:ascii="Symbol" w:hAnsi="Symbol" w:hint="default"/>
+        <w:sz w:val="20"/>
+      </w:rPr>
+    </w:lvl>
+    <w:lvl w:ilvl="4" w:tentative="1">
+      <w:start w:val="1"/>
+      <w:numFmt w:val="bullet"/>
+      <w:lvlText w:val=""/>
+      <w:lvlJc w:val="left"/>
+      <w:pPr>
+        <w:tabs>
+          <w:tab w:val="num" w:pos="3600"/>
+        </w:tabs>
+        <w:ind w:left="3600" w:hanging="360"/>
+      </w:pPr>
+      <w:rPr>
+        <w:rFonts w:ascii="Symbol" w:hAnsi="Symbol" w:hint="default"/>
+        <w:sz w:val="20"/>
+      </w:rPr>
+    </w:lvl>
+    <w:lvl w:ilvl="5" w:tentative="1">
+      <w:start w:val="1"/>
+      <w:numFmt w:val="bullet"/>
+      <w:lvlText w:val=""/>
+      <w:lvlJc w:val="left"/>
+      <w:pPr>
+        <w:tabs>
+          <w:tab w:val="num" w:pos="4320"/>
+        </w:tabs>
+        <w:ind w:left="4320" w:hanging="360"/>
+      </w:pPr>
+      <w:rPr>
+        <w:rFonts w:ascii="Symbol" w:hAnsi="Symbol" w:hint="default"/>
+        <w:sz w:val="20"/>
+      </w:rPr>
+    </w:lvl>
+    <w:lvl w:ilvl="6" w:tentative="1">
+      <w:start w:val="1"/>
+      <w:numFmt w:val="bullet"/>
+      <w:lvlText w:val=""/>
+      <w:lvlJc w:val="left"/>
+      <w:pPr>
+        <w:tabs>
+          <w:tab w:val="num" w:pos="5040"/>
+        </w:tabs>
+        <w:ind w:left="5040" w:hanging="360"/>
+      </w:pPr>
+      <w:rPr>
+        <w:rFonts w:ascii="Symbol" w:hAnsi="Symbol" w:hint="default"/>
+        <w:sz w:val="20"/>
+      </w:rPr>
+    </w:lvl>
+    <w:lvl w:ilvl="7" w:tentative="1">
+      <w:start w:val="1"/>
+      <w:numFmt w:val="bullet"/>
+      <w:lvlText w:val=""/>
+      <w:lvlJc w:val="left"/>
+      <w:pPr>
+        <w:tabs>
+          <w:tab w:val="num" w:pos="5760"/>
+        </w:tabs>
+        <w:ind w:left="5760" w:hanging="360"/>
+      </w:pPr>
+      <w:rPr>
+        <w:rFonts w:ascii="Symbol" w:hAnsi="Symbol" w:hint="default"/>
+        <w:sz w:val="20"/>
+      </w:rPr>
+    </w:lvl>
+    <w:lvl w:ilvl="8" w:tentative="1">
+      <w:start w:val="1"/>
+      <w:numFmt w:val="bullet"/>
+      <w:lvlText w:val=""/>
+      <w:lvlJc w:val="left"/>
+      <w:pPr>
+        <w:tabs>
+          <w:tab w:val="num" w:pos="6480"/>
+        </w:tabs>
+        <w:ind w:left="6480" w:hanging="360"/>
+      </w:pPr>
+      <w:rPr>
+        <w:rFonts w:ascii="Symbol" w:hAnsi="Symbol" w:hint="default"/>
+        <w:sz w:val="20"/>
+      </w:rPr>
+    </w:lvl>
+  </w:abstractNum>
+  <w:abstractNum w:abstractNumId="12" w15:restartNumberingAfterBreak="0">
     <w:nsid w:val="36AC1034"/>
     <w:multiLevelType w:val="hybridMultilevel"/>
     <w:tmpl w:val="B740A130"/>
@@ -10901,7 +13331,7 @@
       </w:rPr>
     </w:lvl>
   </w:abstractNum>
-  <w:abstractNum w:abstractNumId="10" w15:restartNumberingAfterBreak="0">
+  <w:abstractNum w:abstractNumId="13" w15:restartNumberingAfterBreak="0">
     <w:nsid w:val="37155B90"/>
     <w:multiLevelType w:val="multilevel"/>
     <w:tmpl w:val="FA206AB6"/>
@@ -11050,7 +13480,7 @@
       </w:rPr>
     </w:lvl>
   </w:abstractNum>
-  <w:abstractNum w:abstractNumId="11" w15:restartNumberingAfterBreak="0">
+  <w:abstractNum w:abstractNumId="14" w15:restartNumberingAfterBreak="0">
     <w:nsid w:val="3DA24086"/>
     <w:multiLevelType w:val="multilevel"/>
     <w:tmpl w:val="22E4CCD2"/>
@@ -11199,7 +13629,156 @@
       </w:rPr>
     </w:lvl>
   </w:abstractNum>
-  <w:abstractNum w:abstractNumId="12" w15:restartNumberingAfterBreak="0">
+  <w:abstractNum w:abstractNumId="15" w15:restartNumberingAfterBreak="0">
+    <w:nsid w:val="3E6F7BCB"/>
+    <w:multiLevelType w:val="multilevel"/>
+    <w:tmpl w:val="B5EA5F9C"/>
+    <w:lvl w:ilvl="0">
+      <w:start w:val="1"/>
+      <w:numFmt w:val="bullet"/>
+      <w:lvlText w:val=""/>
+      <w:lvlJc w:val="left"/>
+      <w:pPr>
+        <w:tabs>
+          <w:tab w:val="num" w:pos="720"/>
+        </w:tabs>
+        <w:ind w:left="720" w:hanging="360"/>
+      </w:pPr>
+      <w:rPr>
+        <w:rFonts w:ascii="Symbol" w:hAnsi="Symbol" w:hint="default"/>
+        <w:sz w:val="20"/>
+      </w:rPr>
+    </w:lvl>
+    <w:lvl w:ilvl="1" w:tentative="1">
+      <w:start w:val="1"/>
+      <w:numFmt w:val="bullet"/>
+      <w:lvlText w:val=""/>
+      <w:lvlJc w:val="left"/>
+      <w:pPr>
+        <w:tabs>
+          <w:tab w:val="num" w:pos="1440"/>
+        </w:tabs>
+        <w:ind w:left="1440" w:hanging="360"/>
+      </w:pPr>
+      <w:rPr>
+        <w:rFonts w:ascii="Symbol" w:hAnsi="Symbol" w:hint="default"/>
+        <w:sz w:val="20"/>
+      </w:rPr>
+    </w:lvl>
+    <w:lvl w:ilvl="2" w:tentative="1">
+      <w:start w:val="1"/>
+      <w:numFmt w:val="bullet"/>
+      <w:lvlText w:val=""/>
+      <w:lvlJc w:val="left"/>
+      <w:pPr>
+        <w:tabs>
+          <w:tab w:val="num" w:pos="2160"/>
+        </w:tabs>
+        <w:ind w:left="2160" w:hanging="360"/>
+      </w:pPr>
+      <w:rPr>
+        <w:rFonts w:ascii="Symbol" w:hAnsi="Symbol" w:hint="default"/>
+        <w:sz w:val="20"/>
+      </w:rPr>
+    </w:lvl>
+    <w:lvl w:ilvl="3" w:tentative="1">
+      <w:start w:val="1"/>
+      <w:numFmt w:val="bullet"/>
+      <w:lvlText w:val=""/>
+      <w:lvlJc w:val="left"/>
+      <w:pPr>
+        <w:tabs>
+          <w:tab w:val="num" w:pos="2880"/>
+        </w:tabs>
+        <w:ind w:left="2880" w:hanging="360"/>
+      </w:pPr>
+      <w:rPr>
+        <w:rFonts w:ascii="Symbol" w:hAnsi="Symbol" w:hint="default"/>
+        <w:sz w:val="20"/>
+      </w:rPr>
+    </w:lvl>
+    <w:lvl w:ilvl="4" w:tentative="1">
+      <w:start w:val="1"/>
+      <w:numFmt w:val="bullet"/>
+      <w:lvlText w:val=""/>
+      <w:lvlJc w:val="left"/>
+      <w:pPr>
+        <w:tabs>
+          <w:tab w:val="num" w:pos="3600"/>
+        </w:tabs>
+        <w:ind w:left="3600" w:hanging="360"/>
+      </w:pPr>
+      <w:rPr>
+        <w:rFonts w:ascii="Symbol" w:hAnsi="Symbol" w:hint="default"/>
+        <w:sz w:val="20"/>
+      </w:rPr>
+    </w:lvl>
+    <w:lvl w:ilvl="5" w:tentative="1">
+      <w:start w:val="1"/>
+      <w:numFmt w:val="bullet"/>
+      <w:lvlText w:val=""/>
+      <w:lvlJc w:val="left"/>
+      <w:pPr>
+        <w:tabs>
+          <w:tab w:val="num" w:pos="4320"/>
+        </w:tabs>
+        <w:ind w:left="4320" w:hanging="360"/>
+      </w:pPr>
+      <w:rPr>
+        <w:rFonts w:ascii="Symbol" w:hAnsi="Symbol" w:hint="default"/>
+        <w:sz w:val="20"/>
+      </w:rPr>
+    </w:lvl>
+    <w:lvl w:ilvl="6" w:tentative="1">
+      <w:start w:val="1"/>
+      <w:numFmt w:val="bullet"/>
+      <w:lvlText w:val=""/>
+      <w:lvlJc w:val="left"/>
+      <w:pPr>
+        <w:tabs>
+          <w:tab w:val="num" w:pos="5040"/>
+        </w:tabs>
+        <w:ind w:left="5040" w:hanging="360"/>
+      </w:pPr>
+      <w:rPr>
+        <w:rFonts w:ascii="Symbol" w:hAnsi="Symbol" w:hint="default"/>
+        <w:sz w:val="20"/>
+      </w:rPr>
+    </w:lvl>
+    <w:lvl w:ilvl="7" w:tentative="1">
+      <w:start w:val="1"/>
+      <w:numFmt w:val="bullet"/>
+      <w:lvlText w:val=""/>
+      <w:lvlJc w:val="left"/>
+      <w:pPr>
+        <w:tabs>
+          <w:tab w:val="num" w:pos="5760"/>
+        </w:tabs>
+        <w:ind w:left="5760" w:hanging="360"/>
+      </w:pPr>
+      <w:rPr>
+        <w:rFonts w:ascii="Symbol" w:hAnsi="Symbol" w:hint="default"/>
+        <w:sz w:val="20"/>
+      </w:rPr>
+    </w:lvl>
+    <w:lvl w:ilvl="8" w:tentative="1">
+      <w:start w:val="1"/>
+      <w:numFmt w:val="bullet"/>
+      <w:lvlText w:val=""/>
+      <w:lvlJc w:val="left"/>
+      <w:pPr>
+        <w:tabs>
+          <w:tab w:val="num" w:pos="6480"/>
+        </w:tabs>
+        <w:ind w:left="6480" w:hanging="360"/>
+      </w:pPr>
+      <w:rPr>
+        <w:rFonts w:ascii="Symbol" w:hAnsi="Symbol" w:hint="default"/>
+        <w:sz w:val="20"/>
+      </w:rPr>
+    </w:lvl>
+  </w:abstractNum>
+  <w:abstractNum w:abstractNumId="16" w15:restartNumberingAfterBreak="0">
     <w:nsid w:val="416453ED"/>
     <w:multiLevelType w:val="multilevel"/>
     <w:tmpl w:val="DB7A68FA"/>
@@ -11312,7 +13891,7 @@
       </w:pPr>
     </w:lvl>
   </w:abstractNum>
-  <w:abstractNum w:abstractNumId="13" w15:restartNumberingAfterBreak="0">
+  <w:abstractNum w:abstractNumId="17" w15:restartNumberingAfterBreak="0">
     <w:nsid w:val="46E32529"/>
     <w:multiLevelType w:val="multilevel"/>
     <w:tmpl w:val="919E00DA"/>
@@ -11461,7 +14040,7 @@
       </w:rPr>
     </w:lvl>
   </w:abstractNum>
-  <w:abstractNum w:abstractNumId="14" w15:restartNumberingAfterBreak="0">
+  <w:abstractNum w:abstractNumId="18" w15:restartNumberingAfterBreak="0">
     <w:nsid w:val="4E7E6C88"/>
     <w:multiLevelType w:val="hybridMultilevel"/>
     <w:tmpl w:val="BA781E72"/>
@@ -11673,7 +14252,156 @@
       </w:rPr>
     </w:lvl>
   </w:abstractNum>
-  <w:abstractNum w:abstractNumId="15" w15:restartNumberingAfterBreak="0">
+  <w:abstractNum w:abstractNumId="19" w15:restartNumberingAfterBreak="0">
+    <w:nsid w:val="4E9C7475"/>
+    <w:multiLevelType w:val="multilevel"/>
+    <w:tmpl w:val="FD82ED18"/>
+    <w:lvl w:ilvl="0">
+      <w:start w:val="1"/>
+      <w:numFmt w:val="bullet"/>
+      <w:lvlText w:val=""/>
+      <w:lvlJc w:val="left"/>
+      <w:pPr>
+        <w:tabs>
+          <w:tab w:val="num" w:pos="720"/>
+        </w:tabs>
+        <w:ind w:left="720" w:hanging="360"/>
+      </w:pPr>
+      <w:rPr>
+        <w:rFonts w:ascii="Symbol" w:hAnsi="Symbol" w:hint="default"/>
+        <w:sz w:val="20"/>
+      </w:rPr>
+    </w:lvl>
+    <w:lvl w:ilvl="1" w:tentative="1">
+      <w:start w:val="1"/>
+      <w:numFmt w:val="bullet"/>
+      <w:lvlText w:val=""/>
+      <w:lvlJc w:val="left"/>
+      <w:pPr>
+        <w:tabs>
+          <w:tab w:val="num" w:pos="1440"/>
+        </w:tabs>
+        <w:ind w:left="1440" w:hanging="360"/>
+      </w:pPr>
+      <w:rPr>
+        <w:rFonts w:ascii="Symbol" w:hAnsi="Symbol" w:hint="default"/>
+        <w:sz w:val="20"/>
+      </w:rPr>
+    </w:lvl>
+    <w:lvl w:ilvl="2" w:tentative="1">
+      <w:start w:val="1"/>
+      <w:numFmt w:val="bullet"/>
+      <w:lvlText w:val=""/>
+      <w:lvlJc w:val="left"/>
+      <w:pPr>
+        <w:tabs>
+          <w:tab w:val="num" w:pos="2160"/>
+        </w:tabs>
+        <w:ind w:left="2160" w:hanging="360"/>
+      </w:pPr>
+      <w:rPr>
+        <w:rFonts w:ascii="Symbol" w:hAnsi="Symbol" w:hint="default"/>
+        <w:sz w:val="20"/>
+      </w:rPr>
+    </w:lvl>
+    <w:lvl w:ilvl="3" w:tentative="1">
+      <w:start w:val="1"/>
+      <w:numFmt w:val="bullet"/>
+      <w:lvlText w:val=""/>
+      <w:lvlJc w:val="left"/>
+      <w:pPr>
+        <w:tabs>
+          <w:tab w:val="num" w:pos="2880"/>
+        </w:tabs>
+        <w:ind w:left="2880" w:hanging="360"/>
+      </w:pPr>
+      <w:rPr>
+        <w:rFonts w:ascii="Symbol" w:hAnsi="Symbol" w:hint="default"/>
+        <w:sz w:val="20"/>
+      </w:rPr>
+    </w:lvl>
+    <w:lvl w:ilvl="4" w:tentative="1">
+      <w:start w:val="1"/>
+      <w:numFmt w:val="bullet"/>
+      <w:lvlText w:val=""/>
+      <w:lvlJc w:val="left"/>
+      <w:pPr>
+        <w:tabs>
+          <w:tab w:val="num" w:pos="3600"/>
+        </w:tabs>
+        <w:ind w:left="3600" w:hanging="360"/>
+      </w:pPr>
+      <w:rPr>
+        <w:rFonts w:ascii="Symbol" w:hAnsi="Symbol" w:hint="default"/>
+        <w:sz w:val="20"/>
+      </w:rPr>
+    </w:lvl>
+    <w:lvl w:ilvl="5" w:tentative="1">
+      <w:start w:val="1"/>
+      <w:numFmt w:val="bullet"/>
+      <w:lvlText w:val=""/>
+      <w:lvlJc w:val="left"/>
+      <w:pPr>
+        <w:tabs>
+          <w:tab w:val="num" w:pos="4320"/>
+        </w:tabs>
+        <w:ind w:left="4320" w:hanging="360"/>
+      </w:pPr>
+      <w:rPr>
+        <w:rFonts w:ascii="Symbol" w:hAnsi="Symbol" w:hint="default"/>
+        <w:sz w:val="20"/>
+      </w:rPr>
+    </w:lvl>
+    <w:lvl w:ilvl="6" w:tentative="1">
+      <w:start w:val="1"/>
+      <w:numFmt w:val="bullet"/>
+      <w:lvlText w:val=""/>
+      <w:lvlJc w:val="left"/>
+      <w:pPr>
+        <w:tabs>
+          <w:tab w:val="num" w:pos="5040"/>
+        </w:tabs>
+        <w:ind w:left="5040" w:hanging="360"/>
+      </w:pPr>
+      <w:rPr>
+        <w:rFonts w:ascii="Symbol" w:hAnsi="Symbol" w:hint="default"/>
+        <w:sz w:val="20"/>
+      </w:rPr>
+    </w:lvl>
+    <w:lvl w:ilvl="7" w:tentative="1">
+      <w:start w:val="1"/>
+      <w:numFmt w:val="bullet"/>
+      <w:lvlText w:val=""/>
+      <w:lvlJc w:val="left"/>
+      <w:pPr>
+        <w:tabs>
+          <w:tab w:val="num" w:pos="5760"/>
+        </w:tabs>
+        <w:ind w:left="5760" w:hanging="360"/>
+      </w:pPr>
+      <w:rPr>
+        <w:rFonts w:ascii="Symbol" w:hAnsi="Symbol" w:hint="default"/>
+        <w:sz w:val="20"/>
+      </w:rPr>
+    </w:lvl>
+    <w:lvl w:ilvl="8" w:tentative="1">
+      <w:start w:val="1"/>
+      <w:numFmt w:val="bullet"/>
+      <w:lvlText w:val=""/>
+      <w:lvlJc w:val="left"/>
+      <w:pPr>
+        <w:tabs>
+          <w:tab w:val="num" w:pos="6480"/>
+        </w:tabs>
+        <w:ind w:left="6480" w:hanging="360"/>
+      </w:pPr>
+      <w:rPr>
+        <w:rFonts w:ascii="Symbol" w:hAnsi="Symbol" w:hint="default"/>
+        <w:sz w:val="20"/>
+      </w:rPr>
+    </w:lvl>
+  </w:abstractNum>
+  <w:abstractNum w:abstractNumId="20" w15:restartNumberingAfterBreak="0">
     <w:nsid w:val="546F6E01"/>
     <w:multiLevelType w:val="multilevel"/>
     <w:tmpl w:val="C1240606"/>
@@ -11786,7 +14514,7 @@
       </w:pPr>
     </w:lvl>
   </w:abstractNum>
-  <w:abstractNum w:abstractNumId="16" w15:restartNumberingAfterBreak="0">
+  <w:abstractNum w:abstractNumId="21" w15:restartNumberingAfterBreak="0">
     <w:nsid w:val="55B008C6"/>
     <w:multiLevelType w:val="multilevel"/>
     <w:tmpl w:val="7924E3CC"/>
@@ -11935,7 +14663,7 @@
       </w:rPr>
     </w:lvl>
   </w:abstractNum>
-  <w:abstractNum w:abstractNumId="17" w15:restartNumberingAfterBreak="0">
+  <w:abstractNum w:abstractNumId="22" w15:restartNumberingAfterBreak="0">
     <w:nsid w:val="567334FF"/>
     <w:multiLevelType w:val="multilevel"/>
     <w:tmpl w:val="99666AEC"/>
@@ -12048,7 +14776,120 @@
       </w:pPr>
     </w:lvl>
   </w:abstractNum>
-  <w:abstractNum w:abstractNumId="18" w15:restartNumberingAfterBreak="0">
+  <w:abstractNum w:abstractNumId="23" w15:restartNumberingAfterBreak="0">
+    <w:nsid w:val="57400574"/>
+    <w:multiLevelType w:val="multilevel"/>
+    <w:tmpl w:val="CD3619B4"/>
+    <w:lvl w:ilvl="0">
+      <w:start w:val="1"/>
+      <w:numFmt w:val="decimal"/>
+      <w:lvlText w:val="%1."/>
+      <w:lvlJc w:val="left"/>
+      <w:pPr>
+        <w:tabs>
+          <w:tab w:val="num" w:pos="720"/>
+        </w:tabs>
+        <w:ind w:left="720" w:hanging="360"/>
+      </w:pPr>
+    </w:lvl>
+    <w:lvl w:ilvl="1" w:tentative="1">
+      <w:start w:val="1"/>
+      <w:numFmt w:val="decimal"/>
+      <w:lvlText w:val="%2."/>
+      <w:lvlJc w:val="left"/>
+      <w:pPr>
+        <w:tabs>
+          <w:tab w:val="num" w:pos="1440"/>
+        </w:tabs>
+        <w:ind w:left="1440" w:hanging="360"/>
+      </w:pPr>
+    </w:lvl>
+    <w:lvl w:ilvl="2" w:tentative="1">
+      <w:start w:val="1"/>
+      <w:numFmt w:val="decimal"/>
+      <w:lvlText w:val="%3."/>
+      <w:lvlJc w:val="left"/>
+      <w:pPr>
+        <w:tabs>
+          <w:tab w:val="num" w:pos="2160"/>
+        </w:tabs>
+        <w:ind w:left="2160" w:hanging="360"/>
+      </w:pPr>
+    </w:lvl>
+    <w:lvl w:ilvl="3" w:tentative="1">
+      <w:start w:val="1"/>
+      <w:numFmt w:val="decimal"/>
+      <w:lvlText w:val="%4."/>
+      <w:lvlJc w:val="left"/>
+      <w:pPr>
+        <w:tabs>
+          <w:tab w:val="num" w:pos="2880"/>
+        </w:tabs>
+        <w:ind w:left="2880" w:hanging="360"/>
+      </w:pPr>
+    </w:lvl>
+    <w:lvl w:ilvl="4" w:tentative="1">
+      <w:start w:val="1"/>
+      <w:numFmt w:val="decimal"/>
+      <w:lvlText w:val="%5."/>
+      <w:lvlJc w:val="left"/>
+      <w:pPr>
+        <w:tabs>
+          <w:tab w:val="num" w:pos="3600"/>
+        </w:tabs>
+        <w:ind w:left="3600" w:hanging="360"/>
+      </w:pPr>
+    </w:lvl>
+    <w:lvl w:ilvl="5" w:tentative="1">
+      <w:start w:val="1"/>
+      <w:numFmt w:val="decimal"/>
+      <w:lvlText w:val="%6."/>
+      <w:lvlJc w:val="left"/>
+      <w:pPr>
+        <w:tabs>
+          <w:tab w:val="num" w:pos="4320"/>
+        </w:tabs>
+        <w:ind w:left="4320" w:hanging="360"/>
+      </w:pPr>
+    </w:lvl>
+    <w:lvl w:ilvl="6" w:tentative="1">
+      <w:start w:val="1"/>
+      <w:numFmt w:val="decimal"/>
+      <w:lvlText w:val="%7."/>
+      <w:lvlJc w:val="left"/>
+      <w:pPr>
+        <w:tabs>
+          <w:tab w:val="num" w:pos="5040"/>
+        </w:tabs>
+        <w:ind w:left="5040" w:hanging="360"/>
+      </w:pPr>
+    </w:lvl>
+    <w:lvl w:ilvl="7" w:tentative="1">
+      <w:start w:val="1"/>
+      <w:numFmt w:val="decimal"/>
+      <w:lvlText w:val="%8."/>
+      <w:lvlJc w:val="left"/>
+      <w:pPr>
+        <w:tabs>
+          <w:tab w:val="num" w:pos="5760"/>
+        </w:tabs>
+        <w:ind w:left="5760" w:hanging="360"/>
+      </w:pPr>
+    </w:lvl>
+    <w:lvl w:ilvl="8" w:tentative="1">
+      <w:start w:val="1"/>
+      <w:numFmt w:val="decimal"/>
+      <w:lvlText w:val="%9."/>
+      <w:lvlJc w:val="left"/>
+      <w:pPr>
+        <w:tabs>
+          <w:tab w:val="num" w:pos="6480"/>
+        </w:tabs>
+        <w:ind w:left="6480" w:hanging="360"/>
+      </w:pPr>
+    </w:lvl>
+  </w:abstractNum>
+  <w:abstractNum w:abstractNumId="24" w15:restartNumberingAfterBreak="0">
     <w:nsid w:val="60055F57"/>
     <w:multiLevelType w:val="multilevel"/>
     <w:tmpl w:val="B2121110"/>
@@ -12197,7 +15038,7 @@
       </w:rPr>
     </w:lvl>
   </w:abstractNum>
-  <w:abstractNum w:abstractNumId="19" w15:restartNumberingAfterBreak="0">
+  <w:abstractNum w:abstractNumId="25" w15:restartNumberingAfterBreak="0">
     <w:nsid w:val="627321F1"/>
     <w:multiLevelType w:val="hybridMultilevel"/>
     <w:tmpl w:val="8A0A3366"/>
@@ -12409,7 +15250,269 @@
       </w:rPr>
     </w:lvl>
   </w:abstractNum>
-  <w:abstractNum w:abstractNumId="20" w15:restartNumberingAfterBreak="0">
+  <w:abstractNum w:abstractNumId="26" w15:restartNumberingAfterBreak="0">
+    <w:nsid w:val="62B20494"/>
+    <w:multiLevelType w:val="multilevel"/>
+    <w:tmpl w:val="B1DE2E84"/>
+    <w:lvl w:ilvl="0">
+      <w:start w:val="1"/>
+      <w:numFmt w:val="decimal"/>
+      <w:lvlText w:val="%1."/>
+      <w:lvlJc w:val="left"/>
+      <w:pPr>
+        <w:tabs>
+          <w:tab w:val="num" w:pos="720"/>
+        </w:tabs>
+        <w:ind w:left="720" w:hanging="360"/>
+      </w:pPr>
+    </w:lvl>
+    <w:lvl w:ilvl="1" w:tentative="1">
+      <w:start w:val="1"/>
+      <w:numFmt w:val="decimal"/>
+      <w:lvlText w:val="%2."/>
+      <w:lvlJc w:val="left"/>
+      <w:pPr>
+        <w:tabs>
+          <w:tab w:val="num" w:pos="1440"/>
+        </w:tabs>
+        <w:ind w:left="1440" w:hanging="360"/>
+      </w:pPr>
+    </w:lvl>
+    <w:lvl w:ilvl="2" w:tentative="1">
+      <w:start w:val="1"/>
+      <w:numFmt w:val="decimal"/>
+      <w:lvlText w:val="%3."/>
+      <w:lvlJc w:val="left"/>
+      <w:pPr>
+        <w:tabs>
+          <w:tab w:val="num" w:pos="2160"/>
+        </w:tabs>
+        <w:ind w:left="2160" w:hanging="360"/>
+      </w:pPr>
+    </w:lvl>
+    <w:lvl w:ilvl="3" w:tentative="1">
+      <w:start w:val="1"/>
+      <w:numFmt w:val="decimal"/>
+      <w:lvlText w:val="%4."/>
+      <w:lvlJc w:val="left"/>
+      <w:pPr>
+        <w:tabs>
+          <w:tab w:val="num" w:pos="2880"/>
+        </w:tabs>
+        <w:ind w:left="2880" w:hanging="360"/>
+      </w:pPr>
+    </w:lvl>
+    <w:lvl w:ilvl="4" w:tentative="1">
+      <w:start w:val="1"/>
+      <w:numFmt w:val="decimal"/>
+      <w:lvlText w:val="%5."/>
+      <w:lvlJc w:val="left"/>
+      <w:pPr>
+        <w:tabs>
+          <w:tab w:val="num" w:pos="3600"/>
+        </w:tabs>
+        <w:ind w:left="3600" w:hanging="360"/>
+      </w:pPr>
+    </w:lvl>
+    <w:lvl w:ilvl="5" w:tentative="1">
+      <w:start w:val="1"/>
+      <w:numFmt w:val="decimal"/>
+      <w:lvlText w:val="%6."/>
+      <w:lvlJc w:val="left"/>
+      <w:pPr>
+        <w:tabs>
+          <w:tab w:val="num" w:pos="4320"/>
+        </w:tabs>
+        <w:ind w:left="4320" w:hanging="360"/>
+      </w:pPr>
+    </w:lvl>
+    <w:lvl w:ilvl="6" w:tentative="1">
+      <w:start w:val="1"/>
+      <w:numFmt w:val="decimal"/>
+      <w:lvlText w:val="%7."/>
+      <w:lvlJc w:val="left"/>
+      <w:pPr>
+        <w:tabs>
+          <w:tab w:val="num" w:pos="5040"/>
+        </w:tabs>
+        <w:ind w:left="5040" w:hanging="360"/>
+      </w:pPr>
+    </w:lvl>
+    <w:lvl w:ilvl="7" w:tentative="1">
+      <w:start w:val="1"/>
+      <w:numFmt w:val="decimal"/>
+      <w:lvlText w:val="%8."/>
+      <w:lvlJc w:val="left"/>
+      <w:pPr>
+        <w:tabs>
+          <w:tab w:val="num" w:pos="5760"/>
+        </w:tabs>
+        <w:ind w:left="5760" w:hanging="360"/>
+      </w:pPr>
+    </w:lvl>
+    <w:lvl w:ilvl="8" w:tentative="1">
+      <w:start w:val="1"/>
+      <w:numFmt w:val="decimal"/>
+      <w:lvlText w:val="%9."/>
+      <w:lvlJc w:val="left"/>
+      <w:pPr>
+        <w:tabs>
+          <w:tab w:val="num" w:pos="6480"/>
+        </w:tabs>
+        <w:ind w:left="6480" w:hanging="360"/>
+      </w:pPr>
+    </w:lvl>
+  </w:abstractNum>
+  <w:abstractNum w:abstractNumId="27" w15:restartNumberingAfterBreak="0">
+    <w:nsid w:val="65F82477"/>
+    <w:multiLevelType w:val="multilevel"/>
+    <w:tmpl w:val="5D7CC22C"/>
+    <w:lvl w:ilvl="0">
+      <w:start w:val="1"/>
+      <w:numFmt w:val="bullet"/>
+      <w:lvlText w:val=""/>
+      <w:lvlJc w:val="left"/>
+      <w:pPr>
+        <w:tabs>
+          <w:tab w:val="num" w:pos="720"/>
+        </w:tabs>
+        <w:ind w:left="720" w:hanging="360"/>
+      </w:pPr>
+      <w:rPr>
+        <w:rFonts w:ascii="Symbol" w:hAnsi="Symbol" w:hint="default"/>
+        <w:sz w:val="20"/>
+      </w:rPr>
+    </w:lvl>
+    <w:lvl w:ilvl="1" w:tentative="1">
+      <w:start w:val="1"/>
+      <w:numFmt w:val="bullet"/>
+      <w:lvlText w:val=""/>
+      <w:lvlJc w:val="left"/>
+      <w:pPr>
+        <w:tabs>
+          <w:tab w:val="num" w:pos="1440"/>
+        </w:tabs>
+        <w:ind w:left="1440" w:hanging="360"/>
+      </w:pPr>
+      <w:rPr>
+        <w:rFonts w:ascii="Symbol" w:hAnsi="Symbol" w:hint="default"/>
+        <w:sz w:val="20"/>
+      </w:rPr>
+    </w:lvl>
+    <w:lvl w:ilvl="2" w:tentative="1">
+      <w:start w:val="1"/>
+      <w:numFmt w:val="bullet"/>
+      <w:lvlText w:val=""/>
+      <w:lvlJc w:val="left"/>
+      <w:pPr>
+        <w:tabs>
+          <w:tab w:val="num" w:pos="2160"/>
+        </w:tabs>
+        <w:ind w:left="2160" w:hanging="360"/>
+      </w:pPr>
+      <w:rPr>
+        <w:rFonts w:ascii="Symbol" w:hAnsi="Symbol" w:hint="default"/>
+        <w:sz w:val="20"/>
+      </w:rPr>
+    </w:lvl>
+    <w:lvl w:ilvl="3" w:tentative="1">
+      <w:start w:val="1"/>
+      <w:numFmt w:val="bullet"/>
+      <w:lvlText w:val=""/>
+      <w:lvlJc w:val="left"/>
+      <w:pPr>
+        <w:tabs>
+          <w:tab w:val="num" w:pos="2880"/>
+        </w:tabs>
+        <w:ind w:left="2880" w:hanging="360"/>
+      </w:pPr>
+      <w:rPr>
+        <w:rFonts w:ascii="Symbol" w:hAnsi="Symbol" w:hint="default"/>
+        <w:sz w:val="20"/>
+      </w:rPr>
+    </w:lvl>
+    <w:lvl w:ilvl="4" w:tentative="1">
+      <w:start w:val="1"/>
+      <w:numFmt w:val="bullet"/>
+      <w:lvlText w:val=""/>
+      <w:lvlJc w:val="left"/>
+      <w:pPr>
+        <w:tabs>
+          <w:tab w:val="num" w:pos="3600"/>
+        </w:tabs>
+        <w:ind w:left="3600" w:hanging="360"/>
+      </w:pPr>
+      <w:rPr>
+        <w:rFonts w:ascii="Symbol" w:hAnsi="Symbol" w:hint="default"/>
+        <w:sz w:val="20"/>
+      </w:rPr>
+    </w:lvl>
+    <w:lvl w:ilvl="5" w:tentative="1">
+      <w:start w:val="1"/>
+      <w:numFmt w:val="bullet"/>
+      <w:lvlText w:val=""/>
+      <w:lvlJc w:val="left"/>
+      <w:pPr>
+        <w:tabs>
+          <w:tab w:val="num" w:pos="4320"/>
+        </w:tabs>
+        <w:ind w:left="4320" w:hanging="360"/>
+      </w:pPr>
+      <w:rPr>
+        <w:rFonts w:ascii="Symbol" w:hAnsi="Symbol" w:hint="default"/>
+        <w:sz w:val="20"/>
+      </w:rPr>
+    </w:lvl>
+    <w:lvl w:ilvl="6" w:tentative="1">
+      <w:start w:val="1"/>
+      <w:numFmt w:val="bullet"/>
+      <w:lvlText w:val=""/>
+      <w:lvlJc w:val="left"/>
+      <w:pPr>
+        <w:tabs>
+          <w:tab w:val="num" w:pos="5040"/>
+        </w:tabs>
+        <w:ind w:left="5040" w:hanging="360"/>
+      </w:pPr>
+      <w:rPr>
+        <w:rFonts w:ascii="Symbol" w:hAnsi="Symbol" w:hint="default"/>
+        <w:sz w:val="20"/>
+      </w:rPr>
+    </w:lvl>
+    <w:lvl w:ilvl="7" w:tentative="1">
+      <w:start w:val="1"/>
+      <w:numFmt w:val="bullet"/>
+      <w:lvlText w:val=""/>
+      <w:lvlJc w:val="left"/>
+      <w:pPr>
+        <w:tabs>
+          <w:tab w:val="num" w:pos="5760"/>
+        </w:tabs>
+        <w:ind w:left="5760" w:hanging="360"/>
+      </w:pPr>
+      <w:rPr>
+        <w:rFonts w:ascii="Symbol" w:hAnsi="Symbol" w:hint="default"/>
+        <w:sz w:val="20"/>
+      </w:rPr>
+    </w:lvl>
+    <w:lvl w:ilvl="8" w:tentative="1">
+      <w:start w:val="1"/>
+      <w:numFmt w:val="bullet"/>
+      <w:lvlText w:val=""/>
+      <w:lvlJc w:val="left"/>
+      <w:pPr>
+        <w:tabs>
+          <w:tab w:val="num" w:pos="6480"/>
+        </w:tabs>
+        <w:ind w:left="6480" w:hanging="360"/>
+      </w:pPr>
+      <w:rPr>
+        <w:rFonts w:ascii="Symbol" w:hAnsi="Symbol" w:hint="default"/>
+        <w:sz w:val="20"/>
+      </w:rPr>
+    </w:lvl>
+  </w:abstractNum>
+  <w:abstractNum w:abstractNumId="28" w15:restartNumberingAfterBreak="0">
     <w:nsid w:val="6BF2629A"/>
     <w:multiLevelType w:val="multilevel"/>
     <w:tmpl w:val="136EC66C"/>
@@ -12558,7 +15661,7 @@
       </w:rPr>
     </w:lvl>
   </w:abstractNum>
-  <w:abstractNum w:abstractNumId="21" w15:restartNumberingAfterBreak="0">
+  <w:abstractNum w:abstractNumId="29" w15:restartNumberingAfterBreak="0">
     <w:nsid w:val="6F9B5700"/>
     <w:multiLevelType w:val="hybridMultilevel"/>
     <w:tmpl w:val="C7023BD6"/>
@@ -12770,7 +15873,156 @@
       </w:rPr>
     </w:lvl>
   </w:abstractNum>
-  <w:abstractNum w:abstractNumId="22" w15:restartNumberingAfterBreak="0">
+  <w:abstractNum w:abstractNumId="30" w15:restartNumberingAfterBreak="0">
+    <w:nsid w:val="704A1350"/>
+    <w:multiLevelType w:val="multilevel"/>
+    <w:tmpl w:val="559EF1CA"/>
+    <w:lvl w:ilvl="0">
+      <w:start w:val="1"/>
+      <w:numFmt w:val="bullet"/>
+      <w:lvlText w:val=""/>
+      <w:lvlJc w:val="left"/>
+      <w:pPr>
+        <w:tabs>
+          <w:tab w:val="num" w:pos="720"/>
+        </w:tabs>
+        <w:ind w:left="720" w:hanging="360"/>
+      </w:pPr>
+      <w:rPr>
+        <w:rFonts w:ascii="Symbol" w:hAnsi="Symbol" w:hint="default"/>
+        <w:sz w:val="20"/>
+      </w:rPr>
+    </w:lvl>
+    <w:lvl w:ilvl="1" w:tentative="1">
+      <w:start w:val="1"/>
+      <w:numFmt w:val="bullet"/>
+      <w:lvlText w:val=""/>
+      <w:lvlJc w:val="left"/>
+      <w:pPr>
+        <w:tabs>
+          <w:tab w:val="num" w:pos="1440"/>
+        </w:tabs>
+        <w:ind w:left="1440" w:hanging="360"/>
+      </w:pPr>
+      <w:rPr>
+        <w:rFonts w:ascii="Symbol" w:hAnsi="Symbol" w:hint="default"/>
+        <w:sz w:val="20"/>
+      </w:rPr>
+    </w:lvl>
+    <w:lvl w:ilvl="2" w:tentative="1">
+      <w:start w:val="1"/>
+      <w:numFmt w:val="bullet"/>
+      <w:lvlText w:val=""/>
+      <w:lvlJc w:val="left"/>
+      <w:pPr>
+        <w:tabs>
+          <w:tab w:val="num" w:pos="2160"/>
+        </w:tabs>
+        <w:ind w:left="2160" w:hanging="360"/>
+      </w:pPr>
+      <w:rPr>
+        <w:rFonts w:ascii="Symbol" w:hAnsi="Symbol" w:hint="default"/>
+        <w:sz w:val="20"/>
+      </w:rPr>
+    </w:lvl>
+    <w:lvl w:ilvl="3" w:tentative="1">
+      <w:start w:val="1"/>
+      <w:numFmt w:val="bullet"/>
+      <w:lvlText w:val=""/>
+      <w:lvlJc w:val="left"/>
+      <w:pPr>
+        <w:tabs>
+          <w:tab w:val="num" w:pos="2880"/>
+        </w:tabs>
+        <w:ind w:left="2880" w:hanging="360"/>
+      </w:pPr>
+      <w:rPr>
+        <w:rFonts w:ascii="Symbol" w:hAnsi="Symbol" w:hint="default"/>
+        <w:sz w:val="20"/>
+      </w:rPr>
+    </w:lvl>
+    <w:lvl w:ilvl="4" w:tentative="1">
+      <w:start w:val="1"/>
+      <w:numFmt w:val="bullet"/>
+      <w:lvlText w:val=""/>
+      <w:lvlJc w:val="left"/>
+      <w:pPr>
+        <w:tabs>
+          <w:tab w:val="num" w:pos="3600"/>
+        </w:tabs>
+        <w:ind w:left="3600" w:hanging="360"/>
+      </w:pPr>
+      <w:rPr>
+        <w:rFonts w:ascii="Symbol" w:hAnsi="Symbol" w:hint="default"/>
+        <w:sz w:val="20"/>
+      </w:rPr>
+    </w:lvl>
+    <w:lvl w:ilvl="5" w:tentative="1">
+      <w:start w:val="1"/>
+      <w:numFmt w:val="bullet"/>
+      <w:lvlText w:val=""/>
+      <w:lvlJc w:val="left"/>
+      <w:pPr>
+        <w:tabs>
+          <w:tab w:val="num" w:pos="4320"/>
+        </w:tabs>
+        <w:ind w:left="4320" w:hanging="360"/>
+      </w:pPr>
+      <w:rPr>
+        <w:rFonts w:ascii="Symbol" w:hAnsi="Symbol" w:hint="default"/>
+        <w:sz w:val="20"/>
+      </w:rPr>
+    </w:lvl>
+    <w:lvl w:ilvl="6" w:tentative="1">
+      <w:start w:val="1"/>
+      <w:numFmt w:val="bullet"/>
+      <w:lvlText w:val=""/>
+      <w:lvlJc w:val="left"/>
+      <w:pPr>
+        <w:tabs>
+          <w:tab w:val="num" w:pos="5040"/>
+        </w:tabs>
+        <w:ind w:left="5040" w:hanging="360"/>
+      </w:pPr>
+      <w:rPr>
+        <w:rFonts w:ascii="Symbol" w:hAnsi="Symbol" w:hint="default"/>
+        <w:sz w:val="20"/>
+      </w:rPr>
+    </w:lvl>
+    <w:lvl w:ilvl="7" w:tentative="1">
+      <w:start w:val="1"/>
+      <w:numFmt w:val="bullet"/>
+      <w:lvlText w:val=""/>
+      <w:lvlJc w:val="left"/>
+      <w:pPr>
+        <w:tabs>
+          <w:tab w:val="num" w:pos="5760"/>
+        </w:tabs>
+        <w:ind w:left="5760" w:hanging="360"/>
+      </w:pPr>
+      <w:rPr>
+        <w:rFonts w:ascii="Symbol" w:hAnsi="Symbol" w:hint="default"/>
+        <w:sz w:val="20"/>
+      </w:rPr>
+    </w:lvl>
+    <w:lvl w:ilvl="8" w:tentative="1">
+      <w:start w:val="1"/>
+      <w:numFmt w:val="bullet"/>
+      <w:lvlText w:val=""/>
+      <w:lvlJc w:val="left"/>
+      <w:pPr>
+        <w:tabs>
+          <w:tab w:val="num" w:pos="6480"/>
+        </w:tabs>
+        <w:ind w:left="6480" w:hanging="360"/>
+      </w:pPr>
+      <w:rPr>
+        <w:rFonts w:ascii="Symbol" w:hAnsi="Symbol" w:hint="default"/>
+        <w:sz w:val="20"/>
+      </w:rPr>
+    </w:lvl>
+  </w:abstractNum>
+  <w:abstractNum w:abstractNumId="31" w15:restartNumberingAfterBreak="0">
     <w:nsid w:val="76C10D4E"/>
     <w:multiLevelType w:val="multilevel"/>
     <w:tmpl w:val="44947326"/>
@@ -12919,74 +16171,253 @@
       </w:rPr>
     </w:lvl>
   </w:abstractNum>
+  <w:abstractNum w:abstractNumId="32" w15:restartNumberingAfterBreak="0">
+    <w:nsid w:val="781E5B04"/>
+    <w:multiLevelType w:val="multilevel"/>
+    <w:tmpl w:val="0086706E"/>
+    <w:lvl w:ilvl="0">
+      <w:start w:val="1"/>
+      <w:numFmt w:val="bullet"/>
+      <w:lvlText w:val=""/>
+      <w:lvlJc w:val="left"/>
+      <w:pPr>
+        <w:tabs>
+          <w:tab w:val="num" w:pos="720"/>
+        </w:tabs>
+        <w:ind w:left="720" w:hanging="360"/>
+      </w:pPr>
+      <w:rPr>
+        <w:rFonts w:ascii="Symbol" w:hAnsi="Symbol" w:hint="default"/>
+        <w:sz w:val="20"/>
+      </w:rPr>
+    </w:lvl>
+    <w:lvl w:ilvl="1" w:tentative="1">
+      <w:start w:val="1"/>
+      <w:numFmt w:val="bullet"/>
+      <w:lvlText w:val=""/>
+      <w:lvlJc w:val="left"/>
+      <w:pPr>
+        <w:tabs>
+          <w:tab w:val="num" w:pos="1440"/>
+        </w:tabs>
+        <w:ind w:left="1440" w:hanging="360"/>
+      </w:pPr>
+      <w:rPr>
+        <w:rFonts w:ascii="Symbol" w:hAnsi="Symbol" w:hint="default"/>
+        <w:sz w:val="20"/>
+      </w:rPr>
+    </w:lvl>
+    <w:lvl w:ilvl="2" w:tentative="1">
+      <w:start w:val="1"/>
+      <w:numFmt w:val="bullet"/>
+      <w:lvlText w:val=""/>
+      <w:lvlJc w:val="left"/>
+      <w:pPr>
+        <w:tabs>
+          <w:tab w:val="num" w:pos="2160"/>
+        </w:tabs>
+        <w:ind w:left="2160" w:hanging="360"/>
+      </w:pPr>
+      <w:rPr>
+        <w:rFonts w:ascii="Symbol" w:hAnsi="Symbol" w:hint="default"/>
+        <w:sz w:val="20"/>
+      </w:rPr>
+    </w:lvl>
+    <w:lvl w:ilvl="3" w:tentative="1">
+      <w:start w:val="1"/>
+      <w:numFmt w:val="bullet"/>
+      <w:lvlText w:val=""/>
+      <w:lvlJc w:val="left"/>
+      <w:pPr>
+        <w:tabs>
+          <w:tab w:val="num" w:pos="2880"/>
+        </w:tabs>
+        <w:ind w:left="2880" w:hanging="360"/>
+      </w:pPr>
+      <w:rPr>
+        <w:rFonts w:ascii="Symbol" w:hAnsi="Symbol" w:hint="default"/>
+        <w:sz w:val="20"/>
+      </w:rPr>
+    </w:lvl>
+    <w:lvl w:ilvl="4" w:tentative="1">
+      <w:start w:val="1"/>
+      <w:numFmt w:val="bullet"/>
+      <w:lvlText w:val=""/>
+      <w:lvlJc w:val="left"/>
+      <w:pPr>
+        <w:tabs>
+          <w:tab w:val="num" w:pos="3600"/>
+        </w:tabs>
+        <w:ind w:left="3600" w:hanging="360"/>
+      </w:pPr>
+      <w:rPr>
+        <w:rFonts w:ascii="Symbol" w:hAnsi="Symbol" w:hint="default"/>
+        <w:sz w:val="20"/>
+      </w:rPr>
+    </w:lvl>
+    <w:lvl w:ilvl="5" w:tentative="1">
+      <w:start w:val="1"/>
+      <w:numFmt w:val="bullet"/>
+      <w:lvlText w:val=""/>
+      <w:lvlJc w:val="left"/>
+      <w:pPr>
+        <w:tabs>
+          <w:tab w:val="num" w:pos="4320"/>
+        </w:tabs>
+        <w:ind w:left="4320" w:hanging="360"/>
+      </w:pPr>
+      <w:rPr>
+        <w:rFonts w:ascii="Symbol" w:hAnsi="Symbol" w:hint="default"/>
+        <w:sz w:val="20"/>
+      </w:rPr>
+    </w:lvl>
+    <w:lvl w:ilvl="6" w:tentative="1">
+      <w:start w:val="1"/>
+      <w:numFmt w:val="bullet"/>
+      <w:lvlText w:val=""/>
+      <w:lvlJc w:val="left"/>
+      <w:pPr>
+        <w:tabs>
+          <w:tab w:val="num" w:pos="5040"/>
+        </w:tabs>
+        <w:ind w:left="5040" w:hanging="360"/>
+      </w:pPr>
+      <w:rPr>
+        <w:rFonts w:ascii="Symbol" w:hAnsi="Symbol" w:hint="default"/>
+        <w:sz w:val="20"/>
+      </w:rPr>
+    </w:lvl>
+    <w:lvl w:ilvl="7" w:tentative="1">
+      <w:start w:val="1"/>
+      <w:numFmt w:val="bullet"/>
+      <w:lvlText w:val=""/>
+      <w:lvlJc w:val="left"/>
+      <w:pPr>
+        <w:tabs>
+          <w:tab w:val="num" w:pos="5760"/>
+        </w:tabs>
+        <w:ind w:left="5760" w:hanging="360"/>
+      </w:pPr>
+      <w:rPr>
+        <w:rFonts w:ascii="Symbol" w:hAnsi="Symbol" w:hint="default"/>
+        <w:sz w:val="20"/>
+      </w:rPr>
+    </w:lvl>
+    <w:lvl w:ilvl="8" w:tentative="1">
+      <w:start w:val="1"/>
+      <w:numFmt w:val="bullet"/>
+      <w:lvlText w:val=""/>
+      <w:lvlJc w:val="left"/>
+      <w:pPr>
+        <w:tabs>
+          <w:tab w:val="num" w:pos="6480"/>
+        </w:tabs>
+        <w:ind w:left="6480" w:hanging="360"/>
+      </w:pPr>
+      <w:rPr>
+        <w:rFonts w:ascii="Symbol" w:hAnsi="Symbol" w:hint="default"/>
+        <w:sz w:val="20"/>
+      </w:rPr>
+    </w:lvl>
+  </w:abstractNum>
   <w:num w:numId="1" w16cid:durableId="203176459">
-    <w:abstractNumId w:val="2"/>
+    <w:abstractNumId w:val="3"/>
   </w:num>
   <w:num w:numId="2" w16cid:durableId="2063939894">
-    <w:abstractNumId w:val="9"/>
+    <w:abstractNumId w:val="12"/>
   </w:num>
   <w:num w:numId="3" w16cid:durableId="1179738660">
-    <w:abstractNumId w:val="14"/>
+    <w:abstractNumId w:val="18"/>
   </w:num>
   <w:num w:numId="4" w16cid:durableId="966281953">
-    <w:abstractNumId w:val="6"/>
+    <w:abstractNumId w:val="7"/>
   </w:num>
   <w:num w:numId="5" w16cid:durableId="1476289628">
-    <w:abstractNumId w:val="21"/>
+    <w:abstractNumId w:val="29"/>
   </w:num>
   <w:num w:numId="6" w16cid:durableId="1758986404">
-    <w:abstractNumId w:val="19"/>
+    <w:abstractNumId w:val="25"/>
   </w:num>
   <w:num w:numId="7" w16cid:durableId="1719816553">
-    <w:abstractNumId w:val="7"/>
+    <w:abstractNumId w:val="9"/>
   </w:num>
   <w:num w:numId="8" w16cid:durableId="1672877955">
     <w:abstractNumId w:val="1"/>
   </w:num>
   <w:num w:numId="9" w16cid:durableId="719672832">
-    <w:abstractNumId w:val="15"/>
+    <w:abstractNumId w:val="20"/>
   </w:num>
   <w:num w:numId="10" w16cid:durableId="1982730971">
-    <w:abstractNumId w:val="18"/>
+    <w:abstractNumId w:val="24"/>
   </w:num>
   <w:num w:numId="11" w16cid:durableId="908466610">
-    <w:abstractNumId w:val="3"/>
+    <w:abstractNumId w:val="4"/>
   </w:num>
   <w:num w:numId="12" w16cid:durableId="1125395069">
     <w:abstractNumId w:val="0"/>
   </w:num>
   <w:num w:numId="13" w16cid:durableId="287010809">
+    <w:abstractNumId w:val="14"/>
+  </w:num>
+  <w:num w:numId="14" w16cid:durableId="1215196671">
+    <w:abstractNumId w:val="28"/>
+  </w:num>
+  <w:num w:numId="15" w16cid:durableId="63258013">
+    <w:abstractNumId w:val="6"/>
+  </w:num>
+  <w:num w:numId="16" w16cid:durableId="1991858840">
+    <w:abstractNumId w:val="31"/>
+  </w:num>
+  <w:num w:numId="17" w16cid:durableId="1652564698">
+    <w:abstractNumId w:val="21"/>
+  </w:num>
+  <w:num w:numId="18" w16cid:durableId="397285749">
+    <w:abstractNumId w:val="13"/>
+  </w:num>
+  <w:num w:numId="19" w16cid:durableId="51389973">
+    <w:abstractNumId w:val="17"/>
+  </w:num>
+  <w:num w:numId="20" w16cid:durableId="1904481458">
+    <w:abstractNumId w:val="10"/>
+  </w:num>
+  <w:num w:numId="21" w16cid:durableId="1316957615">
+    <w:abstractNumId w:val="5"/>
+  </w:num>
+  <w:num w:numId="22" w16cid:durableId="1441408891">
+    <w:abstractNumId w:val="16"/>
+  </w:num>
+  <w:num w:numId="23" w16cid:durableId="873421468">
+    <w:abstractNumId w:val="22"/>
+  </w:num>
+  <w:num w:numId="24" w16cid:durableId="979117667">
+    <w:abstractNumId w:val="19"/>
+  </w:num>
+  <w:num w:numId="25" w16cid:durableId="993096655">
+    <w:abstractNumId w:val="23"/>
+  </w:num>
+  <w:num w:numId="26" w16cid:durableId="359550827">
+    <w:abstractNumId w:val="8"/>
+  </w:num>
+  <w:num w:numId="27" w16cid:durableId="1237325744">
+    <w:abstractNumId w:val="2"/>
+  </w:num>
+  <w:num w:numId="28" w16cid:durableId="1494949347">
+    <w:abstractNumId w:val="27"/>
+  </w:num>
+  <w:num w:numId="29" w16cid:durableId="1359357142">
     <w:abstractNumId w:val="11"/>
   </w:num>
-  <w:num w:numId="14" w16cid:durableId="1215196671">
-    <w:abstractNumId w:val="20"/>
+  <w:num w:numId="30" w16cid:durableId="946621025">
+    <w:abstractNumId w:val="30"/>
   </w:num>
-  <w:num w:numId="15" w16cid:durableId="63258013">
-    <w:abstractNumId w:val="5"/>
+  <w:num w:numId="31" w16cid:durableId="619071628">
+    <w:abstractNumId w:val="15"/>
   </w:num>
-  <w:num w:numId="16" w16cid:durableId="1991858840">
-    <w:abstractNumId w:val="22"/>
+  <w:num w:numId="32" w16cid:durableId="1552841978">
+    <w:abstractNumId w:val="32"/>
   </w:num>
-  <w:num w:numId="17" w16cid:durableId="1652564698">
-    <w:abstractNumId w:val="16"/>
-  </w:num>
-  <w:num w:numId="18" w16cid:durableId="397285749">
-    <w:abstractNumId w:val="10"/>
-  </w:num>
-  <w:num w:numId="19" w16cid:durableId="51389973">
-    <w:abstractNumId w:val="13"/>
-  </w:num>
-  <w:num w:numId="20" w16cid:durableId="1904481458">
-    <w:abstractNumId w:val="8"/>
-  </w:num>
-  <w:num w:numId="21" w16cid:durableId="1316957615">
-    <w:abstractNumId w:val="4"/>
-  </w:num>
-  <w:num w:numId="22" w16cid:durableId="1441408891">
-    <w:abstractNumId w:val="12"/>
-  </w:num>
-  <w:num w:numId="23" w16cid:durableId="873421468">
-    <w:abstractNumId w:val="17"/>
+  <w:num w:numId="33" w16cid:durableId="1968395465">
+    <w:abstractNumId w:val="26"/>
   </w:num>
 </w:numbering>
 </file>
@@ -13441,6 +16872,28 @@
       <w:color w:val="222222"/>
     </w:rPr>
   </w:style>
+  <w:style w:type="paragraph" w:styleId="Heading3">
+    <w:name w:val="heading 3"/>
+    <w:basedOn w:val="Normal"/>
+    <w:next w:val="Normal"/>
+    <w:link w:val="Heading3Char"/>
+    <w:uiPriority w:val="9"/>
+    <w:semiHidden/>
+    <w:unhideWhenUsed/>
+    <w:qFormat/>
+    <w:rsid w:val="00BE6257"/>
+    <w:pPr>
+      <w:keepNext/>
+      <w:keepLines/>
+      <w:spacing w:before="40" w:after="0"/>
+      <w:outlineLvl w:val="2"/>
+    </w:pPr>
+    <w:rPr>
+      <w:rFonts w:asciiTheme="majorHAnsi" w:eastAsiaTheme="majorEastAsia" w:hAnsiTheme="majorHAnsi" w:cstheme="majorBidi"/>
+      <w:color w:val="0A2F40" w:themeColor="accent1" w:themeShade="7F"/>
+      <w:sz w:val="24"/>
+    </w:rPr>
+  </w:style>
   <w:style w:type="character" w:default="1" w:styleId="DefaultParagraphFont">
     <w:name w:val="Default Paragraph Font"/>
     <w:uiPriority w:val="1"/>
@@ -13522,6 +16975,18 @@
     <w:rPr>
       <w:color w:val="605E5C"/>
       <w:shd w:val="clear" w:color="auto" w:fill="E1DFDD"/>
+    </w:rPr>
+  </w:style>
+  <w:style w:type="character" w:customStyle="1" w:styleId="Heading3Char">
+    <w:name w:val="Heading 3 Char"/>
+    <w:basedOn w:val="DefaultParagraphFont"/>
+    <w:link w:val="Heading3"/>
+    <w:uiPriority w:val="9"/>
+    <w:semiHidden/>
+    <w:rsid w:val="00BE6257"/>
+    <w:rPr>
+      <w:rFonts w:asciiTheme="majorHAnsi" w:eastAsiaTheme="majorEastAsia" w:hAnsiTheme="majorHAnsi" w:cstheme="majorBidi"/>
+      <w:color w:val="0A2F40" w:themeColor="accent1" w:themeShade="7F"/>
     </w:rPr>
   </w:style>
 </w:styles>

</xml_diff>